<commit_message>
Remove travessoes dos dois registros 1on1 em Word
Troca cada travessao por pontuacao equivalente (virgula, ponto, dois-pontos
ou conectivo), preservando o sentido de cada frase. 21 ocorrencias ajustadas
nos dois arquivos, incluindo titulos e celulas de tabela.
</commit_message>
<xml_diff>
--- a/1on1/1on1 - Clarissa.docx
+++ b/1on1/1on1 - Clarissa.docx
@@ -12,7 +12,7 @@
           <w:color w:val="C4122F"/>
           <w:sz w:val="40"/>
         </w:rPr>
-        <w:t>1on1 — Clarissa</w:t>
+        <w:t>1on1 com Clarissa</w:t>
       </w:r>
     </w:p>
     <w:p>
@@ -39,7 +39,7 @@
           <w:color w:val="8E0C22"/>
           <w:sz w:val="19"/>
         </w:rPr>
-        <w:t>Contexto que muda a leitura desta conversa: a Clarissa não pretende prestar processo seletivo de consultoria — busca repertório de estratégia e business sense. Por isso o bloco de Preparação para o Mercado e as perguntas sobre etapas de PS e empresas foram pulados de propósito. Onde aparece “não se aplica”, não é resposta faltando: é pergunta que não cabia no caso dela.</w:t>
+        <w:t>Contexto que muda a leitura desta conversa: a Clarissa não pretende prestar processo seletivo de consultoria. Busca repertório de estratégia e business sense. Por isso o bloco de Preparação para o Mercado e as perguntas sobre etapas de PS e empresas foram pulados de propósito. Onde aparece “não se aplica”, não é resposta faltando: é pergunta que não cabia no caso dela.</w:t>
       </w:r>
     </w:p>
     <w:p>
@@ -177,7 +177,7 @@
               <w:rPr>
                 <w:sz w:val="19"/>
               </w:rPr>
-              <w:t>Não pretende prestar — quer algo mais voltado para estratégia, e é esse o interesse no clube</w:t>
+              <w:t>Não pretende prestar. Quer algo mais voltado para estratégia, e é esse o interesse no clube</w:t>
             </w:r>
           </w:p>
         </w:tc>
@@ -235,7 +235,7 @@
               <w:rPr>
                 <w:sz w:val="19"/>
               </w:rPr>
-              <w:t>Desenvolver raciocínio de consultor e business sense, além do networking — sente que o clube estimula muito isso</w:t>
+              <w:t>Desenvolver raciocínio de consultor e business sense, além do networking, e sente que o clube estimula muito isso</w:t>
             </w:r>
           </w:p>
         </w:tc>
@@ -293,7 +293,7 @@
               <w:rPr>
                 <w:sz w:val="19"/>
               </w:rPr>
-              <w:t>Não pretende — é o último semestre em Campinas, depois vai para São Paulo</w:t>
+              <w:t>Não pretende, porque é o último semestre em Campinas, depois vai para São Paulo</w:t>
             </w:r>
           </w:p>
         </w:tc>
@@ -348,7 +348,7 @@
           <w:color w:val="1A1A1A"/>
           <w:sz w:val="21"/>
         </w:rPr>
-        <w:t>A comunicação é a ponte principal entre as empresas, o clube e a comunidade. Como aviso prévio: vai mexer muito com Canva e marketing social — se a pessoa curte, vai ser bem bacana.</w:t>
+        <w:t>A comunicação é a ponte principal entre as empresas, o clube e a comunidade. Como aviso prévio: vai mexer muito com Canva e marketing social, e se a pessoa curte, vai ser bem bacana.</w:t>
       </w:r>
     </w:p>
     <w:p>
@@ -382,7 +382,7 @@
           <w:color w:val="1A1A1A"/>
           <w:sz w:val="21"/>
         </w:rPr>
-        <w:t>Mais útil: gosta muito das palestras e das visitas presenciais, do contato com as empresas. Perda de tempo: não aponta nada, mas acha que algumas reuniões poderiam ser alinhadas por mensagem — às vezes são tão curtas que ficam um pouco maçantes.</w:t>
+        <w:t>Mais útil: gosta muito das palestras e das visitas presenciais, do contato com as empresas. Perda de tempo: não aponta nada, mas acha que algumas reuniões poderiam ser alinhadas por mensagem, porque às vezes são tão curtas que ficam um pouco maçantes.</w:t>
       </w:r>
     </w:p>
     <w:p>
@@ -664,7 +664,7 @@
           <w:color w:val="595959"/>
           <w:sz w:val="20"/>
         </w:rPr>
-        <w:t>Não se aplica — não pretende prestar PS de consultoria.</w:t>
+        <w:t>Não se aplica: não pretende prestar PS de consultoria.</w:t>
       </w:r>
     </w:p>
     <w:p>
@@ -734,7 +734,7 @@
           <w:color w:val="595959"/>
           <w:sz w:val="20"/>
         </w:rPr>
-        <w:t>Não se aplica — não há alvo de PS de consultoria.</w:t>
+        <w:t>Não se aplica: não há alvo de PS de consultoria.</w:t>
       </w:r>
     </w:p>
     <w:p>
@@ -816,7 +816,7 @@
           <w:color w:val="595959"/>
           <w:sz w:val="20"/>
         </w:rPr>
-        <w:t>Sem registro. É a nota de retenção do modelo e está em aberto — ver Pendências.</w:t>
+        <w:t>Sem registro. É a nota de retenção do modelo e está em aberto. Ver Pendências.</w:t>
       </w:r>
     </w:p>
     <w:p>
@@ -980,7 +980,7 @@
         <w:rPr>
           <w:sz w:val="21"/>
         </w:rPr>
-        <w:t>Dois pedidos concretos e acionáveis: mais capacitação em conjunto com as empresas, e transparência do que cada área está fazendo — ela se perdeu durante o PS.</w:t>
+        <w:t>Dois pedidos concretos e acionáveis: mais capacitação em conjunto com as empresas, e transparência do que cada área está fazendo, porque ela se perdeu durante o PS.</w:t>
       </w:r>
     </w:p>
     <w:p>
@@ -1029,7 +1029,7 @@
         <w:rPr>
           <w:sz w:val="21"/>
         </w:rPr>
-        <w:t>Nota de chance de continuar no clube (Q13) não foi registrada — é justamente a nota que dispara conversa de retenção quando fica em 6 ou menos, e no caso dela a mudança para São Paulo é uma variável real. Vale coletar.</w:t>
+        <w:t>Nota de chance de continuar no clube (Q13) não foi registrada, e é justamente a nota que dispara conversa de retenção quando fica em 6 ou menos, e no caso dela a mudança para São Paulo é uma variável real. Vale coletar.</w:t>
       </w:r>
     </w:p>
     <w:p>

</xml_diff>

<commit_message>
Reescreve registros 1on1 em linguagem propria e insere logo do CCU
- Texto refeito em primeira pessoa, como anotacao de conversa: as perguntas
  aparecem no fluxo da frase em vez de codigos Q1..Q16, titulos em caixa
  normal e menos estrutura de relatorio gerado
- Logo do CCU no cabecalho dos dois arquivos, aparece em todas as paginas
- Mantem a correlacao pergunta-resposta, a marcacao do bloco pulado no caso
  da Clarissa, os achados do Prep e as pendencias
- Sem travessoes
</commit_message>
<xml_diff>
--- a/1on1/1on1 - Clarissa.docx
+++ b/1on1/1on1 - Clarissa.docx
@@ -4,1078 +4,521 @@
   <w:body>
     <w:p>
       <w:pPr>
-        <w:spacing w:after="40"/>
+        <w:spacing w:after="20"/>
       </w:pPr>
       <w:r>
         <w:rPr>
           <w:b/>
           <w:color w:val="C4122F"/>
-          <w:sz w:val="40"/>
+          <w:sz w:val="38"/>
         </w:rPr>
         <w:t>1on1 com Clarissa</w:t>
       </w:r>
     </w:p>
     <w:p>
       <w:pPr>
-        <w:spacing w:after="200"/>
+        <w:spacing w:after="240"/>
       </w:pPr>
       <w:r>
         <w:rPr>
           <w:i/>
-          <w:color w:val="595959"/>
+          <w:color w:val="5A5A5A"/>
           <w:sz w:val="19"/>
         </w:rPr>
-        <w:t>Clube de Consultoria Universitário · registro da conversa · fonte: Acompanhamento 1on1 CCU</w:t>
+        <w:t>Anotações da conversa · Clube de Consultoria Universitário</w:t>
+      </w:r>
+    </w:p>
+    <w:p>
+      <w:r>
+        <w:rPr>
+          <w:color w:val="1A1A1A"/>
+        </w:rPr>
+        <w:t>Clarissa é da Farmácia, está no 8º semestre, tem 22 anos e entrou no último PS. Está na Comunicação.</w:t>
+      </w:r>
+    </w:p>
+    <w:p>
+      <w:r>
+        <w:rPr>
+          <w:color w:val="1A1A1A"/>
+        </w:rPr>
+        <w:t>Antes de qualquer coisa, uma observação para quem for ler isso depois: ela não pretende prestar processo seletivo de consultoria. O que ela quer do clube é repertório de estratégia, business sense e networking. Por isso pulei as perguntas de preparação e de empresas, que não fariam sentido no caso dela. Onde eu escrevi que não se aplica, não é resposta faltando.</w:t>
       </w:r>
     </w:p>
     <w:p>
       <w:pPr>
-        <w:spacing w:before="80" w:after="200"/>
-        <w:ind w:left="170"/>
-      </w:pPr>
-      <w:r>
-        <w:rPr>
-          <w:i/>
-          <w:color w:val="8E0C22"/>
-          <w:sz w:val="19"/>
-        </w:rPr>
-        <w:t>Contexto que muda a leitura desta conversa: a Clarissa não pretende prestar processo seletivo de consultoria. Busca repertório de estratégia e business sense. Por isso o bloco de Preparação para o Mercado e as perguntas sobre etapas de PS e empresas foram pulados de propósito. Onde aparece “não se aplica”, não é resposta faltando: é pergunta que não cabia no caso dela.</w:t>
-      </w:r>
-    </w:p>
-    <w:p>
-      <w:pPr>
-        <w:spacing w:before="280" w:after="80"/>
+        <w:spacing w:before="300" w:after="60"/>
       </w:pPr>
       <w:r>
         <w:rPr>
           <w:b/>
           <w:color w:val="C4122F"/>
-          <w:sz w:val="22"/>
+          <w:sz w:val="25"/>
         </w:rPr>
-        <w:t>PERFIL</w:t>
+        <w:t>O básico</w:t>
       </w:r>
-    </w:p>
-    <w:tbl>
-      <w:tblPr>
-        <w:tblStyle w:val="LightList-Accent1"/>
-        <w:tblW w:type="auto" w:w="0"/>
-        <w:jc w:val="left"/>
-        <w:tblLook w:firstColumn="1" w:firstRow="1" w:lastColumn="0" w:lastRow="0" w:noHBand="0" w:noVBand="1" w:val="04A0"/>
-      </w:tblPr>
-      <w:tblGrid>
-        <w:gridCol w:w="4873"/>
-        <w:gridCol w:w="4873"/>
-      </w:tblGrid>
-      <w:tr>
-        <w:tc>
-          <w:tcPr>
-            <w:tcW w:type="dxa" w:w="2608"/>
-          </w:tcPr>
-          <w:p>
-            <w:r>
-              <w:rPr>
-                <w:b/>
-                <w:sz w:val="19"/>
-              </w:rPr>
-              <w:t>Curso / período / idade</w:t>
-            </w:r>
-          </w:p>
-        </w:tc>
-        <w:tc>
-          <w:tcPr>
-            <w:tcW w:type="dxa" w:w="6803"/>
-          </w:tcPr>
-          <w:p>
-            <w:r>
-              <w:rPr>
-                <w:sz w:val="19"/>
-              </w:rPr>
-              <w:t>Farmácia, 8º semestre, 22 anos</w:t>
-            </w:r>
-          </w:p>
-        </w:tc>
-      </w:tr>
-      <w:tr>
-        <w:tc>
-          <w:tcPr>
-            <w:tcW w:type="dxa" w:w="2608"/>
-          </w:tcPr>
-          <w:p>
-            <w:r>
-              <w:rPr>
-                <w:b/>
-                <w:sz w:val="19"/>
-              </w:rPr>
-              <w:t>Tempo de clube</w:t>
-            </w:r>
-          </w:p>
-        </w:tc>
-        <w:tc>
-          <w:tcPr>
-            <w:tcW w:type="dxa" w:w="6803"/>
-          </w:tcPr>
-          <w:p>
-            <w:r>
-              <w:rPr>
-                <w:sz w:val="19"/>
-              </w:rPr>
-              <w:t>Entrou no último PS</w:t>
-            </w:r>
-          </w:p>
-        </w:tc>
-      </w:tr>
-      <w:tr>
-        <w:tc>
-          <w:tcPr>
-            <w:tcW w:type="dxa" w:w="2608"/>
-          </w:tcPr>
-          <w:p>
-            <w:r>
-              <w:rPr>
-                <w:b/>
-                <w:sz w:val="19"/>
-              </w:rPr>
-              <w:t>Área</w:t>
-            </w:r>
-          </w:p>
-        </w:tc>
-        <w:tc>
-          <w:tcPr>
-            <w:tcW w:type="dxa" w:w="6803"/>
-          </w:tcPr>
-          <w:p>
-            <w:r>
-              <w:rPr>
-                <w:sz w:val="19"/>
-              </w:rPr>
-              <w:t>Comunicação (pela própria descrição: ponte entre empresas, clube e comunidade)</w:t>
-            </w:r>
-          </w:p>
-        </w:tc>
-      </w:tr>
-      <w:tr>
-        <w:tc>
-          <w:tcPr>
-            <w:tcW w:type="dxa" w:w="2608"/>
-          </w:tcPr>
-          <w:p>
-            <w:r>
-              <w:rPr>
-                <w:b/>
-                <w:sz w:val="19"/>
-              </w:rPr>
-              <w:t>PS de consultoria</w:t>
-            </w:r>
-          </w:p>
-        </w:tc>
-        <w:tc>
-          <w:tcPr>
-            <w:tcW w:type="dxa" w:w="6803"/>
-          </w:tcPr>
-          <w:p>
-            <w:r>
-              <w:rPr>
-                <w:sz w:val="19"/>
-              </w:rPr>
-              <w:t>Não pretende prestar. Quer algo mais voltado para estratégia, e é esse o interesse no clube</w:t>
-            </w:r>
-          </w:p>
-        </w:tc>
-      </w:tr>
-      <w:tr>
-        <w:tc>
-          <w:tcPr>
-            <w:tcW w:type="dxa" w:w="2608"/>
-          </w:tcPr>
-          <w:p>
-            <w:r>
-              <w:rPr>
-                <w:b/>
-                <w:sz w:val="19"/>
-              </w:rPr>
-              <w:t>Estágio / summer</w:t>
-            </w:r>
-          </w:p>
-        </w:tc>
-        <w:tc>
-          <w:tcPr>
-            <w:tcW w:type="dxa" w:w="6803"/>
-          </w:tcPr>
-          <w:p>
-            <w:r>
-              <w:rPr>
-                <w:sz w:val="19"/>
-              </w:rPr>
-              <w:t>Pensa em fazer estágio, porém voltado para a farmácia</w:t>
-            </w:r>
-          </w:p>
-        </w:tc>
-      </w:tr>
-      <w:tr>
-        <w:tc>
-          <w:tcPr>
-            <w:tcW w:type="dxa" w:w="2608"/>
-          </w:tcPr>
-          <w:p>
-            <w:r>
-              <w:rPr>
-                <w:b/>
-                <w:sz w:val="19"/>
-              </w:rPr>
-              <w:t>Objetivo com o clube</w:t>
-            </w:r>
-          </w:p>
-        </w:tc>
-        <w:tc>
-          <w:tcPr>
-            <w:tcW w:type="dxa" w:w="6803"/>
-          </w:tcPr>
-          <w:p>
-            <w:r>
-              <w:rPr>
-                <w:sz w:val="19"/>
-              </w:rPr>
-              <w:t>Desenvolver raciocínio de consultor e business sense, além do networking, e sente que o clube estimula muito isso</w:t>
-            </w:r>
-          </w:p>
-        </w:tc>
-      </w:tr>
-      <w:tr>
-        <w:tc>
-          <w:tcPr>
-            <w:tcW w:type="dxa" w:w="2608"/>
-          </w:tcPr>
-          <w:p>
-            <w:r>
-              <w:rPr>
-                <w:b/>
-                <w:sz w:val="19"/>
-              </w:rPr>
-              <w:t>Horizonte de saída</w:t>
-            </w:r>
-          </w:p>
-        </w:tc>
-        <w:tc>
-          <w:tcPr>
-            <w:tcW w:type="dxa" w:w="6803"/>
-          </w:tcPr>
-          <w:p>
-            <w:r>
-              <w:rPr>
-                <w:sz w:val="19"/>
-              </w:rPr>
-              <w:t>A rotina do clube não interfere muito na dela; acredita que fica até o 2º semestre de 2027</w:t>
-            </w:r>
-          </w:p>
-        </w:tc>
-      </w:tr>
-      <w:tr>
-        <w:tc>
-          <w:tcPr>
-            <w:tcW w:type="dxa" w:w="2608"/>
-          </w:tcPr>
-          <w:p>
-            <w:r>
-              <w:rPr>
-                <w:b/>
-                <w:sz w:val="19"/>
-              </w:rPr>
-              <w:t>Cargo de diretoria</w:t>
-            </w:r>
-          </w:p>
-        </w:tc>
-        <w:tc>
-          <w:tcPr>
-            <w:tcW w:type="dxa" w:w="6803"/>
-          </w:tcPr>
-          <w:p>
-            <w:r>
-              <w:rPr>
-                <w:sz w:val="19"/>
-              </w:rPr>
-              <w:t>Não pretende, porque é o último semestre em Campinas, depois vai para São Paulo</w:t>
-            </w:r>
-          </w:p>
-        </w:tc>
-      </w:tr>
-    </w:tbl>
-    <w:p>
-      <w:pPr>
-        <w:spacing w:after="40"/>
-      </w:pPr>
     </w:p>
     <w:p>
       <w:pPr>
-        <w:spacing w:before="280" w:after="80"/>
+        <w:spacing w:after="60"/>
+      </w:pPr>
+      <w:r>
+        <w:rPr>
+          <w:b/>
+          <w:sz w:val="21"/>
+        </w:rPr>
+        <w:t xml:space="preserve">Curso e período: </w:t>
+      </w:r>
+      <w:r>
+        <w:rPr>
+          <w:sz w:val="21"/>
+        </w:rPr>
+        <w:t>Farmácia, 8º semestre, 22 anos</w:t>
+      </w:r>
+    </w:p>
+    <w:p>
+      <w:pPr>
+        <w:spacing w:after="60"/>
+      </w:pPr>
+      <w:r>
+        <w:rPr>
+          <w:b/>
+          <w:sz w:val="21"/>
+        </w:rPr>
+        <w:t xml:space="preserve">Tempo de clube: </w:t>
+      </w:r>
+      <w:r>
+        <w:rPr>
+          <w:sz w:val="21"/>
+        </w:rPr>
+        <w:t>entrou no último PS</w:t>
+      </w:r>
+    </w:p>
+    <w:p>
+      <w:pPr>
+        <w:spacing w:after="60"/>
+      </w:pPr>
+      <w:r>
+        <w:rPr>
+          <w:b/>
+          <w:sz w:val="21"/>
+        </w:rPr>
+        <w:t xml:space="preserve">PS de consultoria: </w:t>
+      </w:r>
+      <w:r>
+        <w:rPr>
+          <w:sz w:val="21"/>
+        </w:rPr>
+        <w:t>não pretende prestar, quer algo mais voltado para estratégia</w:t>
+      </w:r>
+    </w:p>
+    <w:p>
+      <w:pPr>
+        <w:spacing w:after="60"/>
+      </w:pPr>
+      <w:r>
+        <w:rPr>
+          <w:b/>
+          <w:sz w:val="21"/>
+        </w:rPr>
+        <w:t xml:space="preserve">Estágio: </w:t>
+      </w:r>
+      <w:r>
+        <w:rPr>
+          <w:sz w:val="21"/>
+        </w:rPr>
+        <w:t>pensa em fazer, mas voltado para a farmácia</w:t>
+      </w:r>
+    </w:p>
+    <w:p>
+      <w:pPr>
+        <w:spacing w:after="60"/>
+      </w:pPr>
+      <w:r>
+        <w:rPr>
+          <w:b/>
+          <w:sz w:val="21"/>
+        </w:rPr>
+        <w:t xml:space="preserve">Objetivo com o clube: </w:t>
+      </w:r>
+      <w:r>
+        <w:rPr>
+          <w:sz w:val="21"/>
+        </w:rPr>
+        <w:t>raciocínio de consultor, business sense e networking</w:t>
+      </w:r>
+    </w:p>
+    <w:p>
+      <w:pPr>
+        <w:spacing w:after="60"/>
+      </w:pPr>
+      <w:r>
+        <w:rPr>
+          <w:b/>
+          <w:sz w:val="21"/>
+        </w:rPr>
+        <w:t xml:space="preserve">Horizonte de saída: </w:t>
+      </w:r>
+      <w:r>
+        <w:rPr>
+          <w:sz w:val="21"/>
+        </w:rPr>
+        <w:t>acredita que fica até o segundo semestre de 2027</w:t>
+      </w:r>
+    </w:p>
+    <w:p>
+      <w:pPr>
+        <w:spacing w:after="60"/>
+      </w:pPr>
+      <w:r>
+        <w:rPr>
+          <w:b/>
+          <w:sz w:val="21"/>
+        </w:rPr>
+        <w:t xml:space="preserve">Diretoria: </w:t>
+      </w:r>
+      <w:r>
+        <w:rPr>
+          <w:sz w:val="21"/>
+        </w:rPr>
+        <w:t>não pretende assumir</w:t>
+      </w:r>
+    </w:p>
+    <w:p>
+      <w:pPr>
+        <w:spacing w:before="300" w:after="60"/>
       </w:pPr>
       <w:r>
         <w:rPr>
           <w:b/>
           <w:color w:val="C4122F"/>
-          <w:sz w:val="22"/>
+          <w:sz w:val="25"/>
         </w:rPr>
-        <w:t>1. COMO ESTÁ SENDO ESTAR AQUI</w:t>
+        <w:t>Como está sendo para ela estar aqui</w:t>
+      </w:r>
+    </w:p>
+    <w:p>
+      <w:r>
+        <w:rPr>
+          <w:color w:val="1A1A1A"/>
+        </w:rPr>
+        <w:t>Perguntei o que ela venderia com orgulho da área dela para um candidato do próximo PS, e o que avisaria antes. Ela disse que a comunicação é a ponte principal entre as empresas, o clube e a comunidade. O aviso é que vai mexer muito com Canva e marketing social, então quem curte isso vai gostar bastante.</w:t>
+      </w:r>
+    </w:p>
+    <w:p>
+      <w:r>
+        <w:rPr>
+          <w:color w:val="1A1A1A"/>
+        </w:rPr>
+        <w:t>Sobre o que o clube entregou de mais útil nos últimos dois meses, ela falou das palestras e das visitas presenciais, do contato com as empresas. Perda de tempo ela não aponta nada, mas acha que algumas reuniões poderiam ser resolvidas por mensagem. Às vezes são tão curtas que acabam ficando maçantes.</w:t>
+      </w:r>
+    </w:p>
+    <w:p>
+      <w:r>
+        <w:rPr>
+          <w:color w:val="1A1A1A"/>
+        </w:rPr>
+        <w:t>Perguntei se está satisfeita com a área. Está, e o motivo é concreto: sente que o Procópio conseguiu organizar bem as coisas. Quando ela chegou, achava os recursos meio perdidos, e hoje está tudo mais arrumado no Notion, com o suporte dele.</w:t>
       </w:r>
     </w:p>
     <w:p>
       <w:pPr>
-        <w:spacing w:before="160" w:after="40"/>
+        <w:spacing w:after="160"/>
       </w:pPr>
       <w:r>
         <w:rPr>
-          <w:b/>
-          <w:color w:val="8E0C22"/>
+          <w:i/>
+          <w:color w:val="5A5A5A"/>
           <w:sz w:val="20"/>
         </w:rPr>
-        <w:t xml:space="preserve">Q1  </w:t>
-      </w:r>
-      <w:r>
-        <w:rPr>
-          <w:b/>
-          <w:color w:val="1A1A1A"/>
-          <w:sz w:val="20"/>
-        </w:rPr>
-        <w:t>Se você tivesse que descrever sua área para um candidato do próximo PS, o que você venderia com orgulho e o que você avisaria antes que ele entrasse?</w:t>
+        <w:t>A pergunta sobre o clima da área é rotativa e eu não fiz nessa conversa.</w:t>
       </w:r>
     </w:p>
     <w:p>
       <w:pPr>
-        <w:spacing w:after="80"/>
-        <w:ind w:left="283"/>
-      </w:pPr>
-      <w:r>
-        <w:rPr>
-          <w:color w:val="1A1A1A"/>
-          <w:sz w:val="21"/>
-        </w:rPr>
-        <w:t>A comunicação é a ponte principal entre as empresas, o clube e a comunidade. Como aviso prévio: vai mexer muito com Canva e marketing social, e se a pessoa curte, vai ser bem bacana.</w:t>
-      </w:r>
-    </w:p>
-    <w:p>
-      <w:pPr>
-        <w:spacing w:before="160" w:after="40"/>
-      </w:pPr>
-      <w:r>
-        <w:rPr>
-          <w:b/>
-          <w:color w:val="8E0C22"/>
-          <w:sz w:val="20"/>
-        </w:rPr>
-        <w:t xml:space="preserve">Q2  </w:t>
-      </w:r>
-      <w:r>
-        <w:rPr>
-          <w:b/>
-          <w:color w:val="1A1A1A"/>
-          <w:sz w:val="20"/>
-        </w:rPr>
-        <w:t>Qual foi a coisa mais útil que o clube te entregou nos últimos dois meses, e qual foi a que mais te pareceu perda de tempo?</w:t>
-      </w:r>
-    </w:p>
-    <w:p>
-      <w:pPr>
-        <w:spacing w:after="80"/>
-        <w:ind w:left="283"/>
-      </w:pPr>
-      <w:r>
-        <w:rPr>
-          <w:color w:val="1A1A1A"/>
-          <w:sz w:val="21"/>
-        </w:rPr>
-        <w:t>Mais útil: gosta muito das palestras e das visitas presenciais, do contato com as empresas. Perda de tempo: não aponta nada, mas acha que algumas reuniões poderiam ser alinhadas por mensagem, porque às vezes são tão curtas que ficam um pouco maçantes.</w:t>
-      </w:r>
-    </w:p>
-    <w:p>
-      <w:pPr>
-        <w:spacing w:before="160" w:after="40"/>
-      </w:pPr>
-      <w:r>
-        <w:rPr>
-          <w:b/>
-          <w:color w:val="8E0C22"/>
-          <w:sz w:val="20"/>
-        </w:rPr>
-        <w:t xml:space="preserve">Q3  </w:t>
-      </w:r>
-      <w:r>
-        <w:rPr>
-          <w:b/>
-          <w:color w:val="1A1A1A"/>
-          <w:sz w:val="20"/>
-        </w:rPr>
-        <w:t>Você está satisfeito com a sua área? O que ela faz bem, o que deixa a desejar, e o que precisaria acontecer para você pensar em trocar?</w:t>
-      </w:r>
-    </w:p>
-    <w:p>
-      <w:pPr>
-        <w:spacing w:after="80"/>
-        <w:ind w:left="283"/>
-      </w:pPr>
-      <w:r>
-        <w:rPr>
-          <w:color w:val="1A1A1A"/>
-          <w:sz w:val="21"/>
-        </w:rPr>
-        <w:t>Está bem satisfeita com a área. Sente que o Procópio conseguiu dar uma organizada boa: quando chegou, achava as coisas e os recursos meio perdidos, e hoje está mais organizado no Notion, com o suporte dele.</w:t>
-      </w:r>
-    </w:p>
-    <w:p>
-      <w:pPr>
-        <w:spacing w:before="160" w:after="40"/>
-      </w:pPr>
-      <w:r>
-        <w:rPr>
-          <w:b/>
-          <w:color w:val="8E0C22"/>
-          <w:sz w:val="20"/>
-        </w:rPr>
-        <w:t xml:space="preserve">Q4  </w:t>
-      </w:r>
-      <w:r>
-        <w:rPr>
-          <w:b/>
-          <w:color w:val="1A1A1A"/>
-          <w:sz w:val="20"/>
-        </w:rPr>
-        <w:t>Como você descreveria o clima da sua área hoje? Tem alguém que te puxa para cima e algo que costuma te desanimar?</w:t>
-      </w:r>
-    </w:p>
-    <w:p>
-      <w:pPr>
-        <w:spacing w:after="80"/>
-        <w:ind w:left="283"/>
-      </w:pPr>
-      <w:r>
-        <w:rPr>
-          <w:i/>
-          <w:color w:val="595959"/>
-          <w:sz w:val="20"/>
-        </w:rPr>
-        <w:t>Rotativa não aplicada nesta conversa.</w:t>
-      </w:r>
-    </w:p>
-    <w:p>
-      <w:pPr>
-        <w:spacing w:before="280" w:after="80"/>
+        <w:spacing w:before="300" w:after="60"/>
       </w:pPr>
       <w:r>
         <w:rPr>
           <w:b/>
           <w:color w:val="C4122F"/>
-          <w:sz w:val="22"/>
+          <w:sz w:val="25"/>
         </w:rPr>
-        <w:t>2. ENTREGA, CASES E PROJETOS</w:t>
+        <w:t>Entrega, cases e projetos</w:t>
+      </w:r>
+    </w:p>
+    <w:p>
+      <w:r>
+        <w:rPr>
+          <w:color w:val="1A1A1A"/>
+        </w:rPr>
+        <w:t>Sobre os projetos rodando hoje e o que ela faria diferente, ela está contente com o caminhar do CWC. Como não estava na frente da organização, se sentia um pouco perdida por não receber a informação por mensagem. O que mudaria é incluir as meninas responsáveis desde o começo.</w:t>
+      </w:r>
+    </w:p>
+    <w:p>
+      <w:r>
+        <w:rPr>
+          <w:color w:val="1A1A1A"/>
+        </w:rPr>
+        <w:t>Perguntei se tem algum projeto que ela gostaria de assumir. Ela está contente onde está, no CWC, e gostou de terem abordado temas além da consultoria, porque agregam conhecimento.</w:t>
       </w:r>
     </w:p>
     <w:p>
       <w:pPr>
-        <w:spacing w:before="160" w:after="40"/>
+        <w:spacing w:after="160"/>
       </w:pPr>
       <w:r>
         <w:rPr>
-          <w:b/>
-          <w:color w:val="8E0C22"/>
+          <w:i/>
+          <w:color w:val="5A5A5A"/>
           <w:sz w:val="20"/>
         </w:rPr>
-        <w:t xml:space="preserve">Q5  </w:t>
-      </w:r>
-      <w:r>
-        <w:rPr>
-          <w:b/>
-          <w:color w:val="1A1A1A"/>
-          <w:sz w:val="20"/>
-        </w:rPr>
-        <w:t>Pensando nos projetos internos e externos rodando hoje, qual deles te deixa com a sensação de “eu faria isso diferente”? O que você mudaria?</w:t>
+        <w:t>As perguntas sobre a última entrega e sobre criar um projeto do zero são rotativas e não entraram nessa conversa.</w:t>
       </w:r>
     </w:p>
     <w:p>
       <w:pPr>
-        <w:spacing w:after="80"/>
-        <w:ind w:left="283"/>
-      </w:pPr>
-      <w:r>
-        <w:rPr>
-          <w:color w:val="1A1A1A"/>
-          <w:sz w:val="21"/>
-        </w:rPr>
-        <w:t>Está bem contente com o caminhar do CWC. Como não estava na frente da organização, se sentia um pouco perdida por não ter a informação por mensagem. Mudaria uma coisa: incluir desde o começo as meninas responsáveis.</w:t>
-      </w:r>
-    </w:p>
-    <w:p>
-      <w:pPr>
-        <w:spacing w:before="160" w:after="40"/>
-      </w:pPr>
-      <w:r>
-        <w:rPr>
-          <w:b/>
-          <w:color w:val="8E0C22"/>
-          <w:sz w:val="20"/>
-        </w:rPr>
-        <w:t xml:space="preserve">Q6  </w:t>
-      </w:r>
-      <w:r>
-        <w:rPr>
-          <w:b/>
-          <w:color w:val="1A1A1A"/>
-          <w:sz w:val="20"/>
-        </w:rPr>
-        <w:t>Tem algum projeto, ou tipo de projeto, que você gostaria de assumir? O que te atrai nele e o que hoje te segura de topar?</w:t>
-      </w:r>
-    </w:p>
-    <w:p>
-      <w:pPr>
-        <w:spacing w:after="80"/>
-        <w:ind w:left="283"/>
-      </w:pPr>
-      <w:r>
-        <w:rPr>
-          <w:color w:val="1A1A1A"/>
-          <w:sz w:val="21"/>
-        </w:rPr>
-        <w:t>Atualmente está bem contente trabalhando no CWC, onde foram abordados temas além da consultoria, o que agrega mais conhecimento.</w:t>
-      </w:r>
-    </w:p>
-    <w:p>
-      <w:pPr>
-        <w:spacing w:before="160" w:after="40"/>
-      </w:pPr>
-      <w:r>
-        <w:rPr>
-          <w:b/>
-          <w:color w:val="8E0C22"/>
-          <w:sz w:val="20"/>
-        </w:rPr>
-        <w:t xml:space="preserve">Q7  </w:t>
-      </w:r>
-      <w:r>
-        <w:rPr>
-          <w:b/>
-          <w:color w:val="1A1A1A"/>
-          <w:sz w:val="20"/>
-        </w:rPr>
-        <w:t>Qual foi a última entrega que te deu orgulho, e qual te mostrou um buraco que você ainda precisa fechar?</w:t>
-      </w:r>
-    </w:p>
-    <w:p>
-      <w:pPr>
-        <w:spacing w:after="80"/>
-        <w:ind w:left="283"/>
-      </w:pPr>
-      <w:r>
-        <w:rPr>
-          <w:i/>
-          <w:color w:val="595959"/>
-          <w:sz w:val="20"/>
-        </w:rPr>
-        <w:t>Rotativa não aplicada nesta conversa.</w:t>
-      </w:r>
-    </w:p>
-    <w:p>
-      <w:pPr>
-        <w:spacing w:before="160" w:after="40"/>
-      </w:pPr>
-      <w:r>
-        <w:rPr>
-          <w:b/>
-          <w:color w:val="8E0C22"/>
-          <w:sz w:val="20"/>
-        </w:rPr>
-        <w:t xml:space="preserve">Q8  </w:t>
-      </w:r>
-      <w:r>
-        <w:rPr>
-          <w:b/>
-          <w:color w:val="1A1A1A"/>
-          <w:sz w:val="20"/>
-        </w:rPr>
-        <w:t>Se você pudesse ser dono de um projeto do zero no clube, que problema real você gostaria de resolver e por quê?</w:t>
-      </w:r>
-    </w:p>
-    <w:p>
-      <w:pPr>
-        <w:spacing w:after="80"/>
-        <w:ind w:left="283"/>
-      </w:pPr>
-      <w:r>
-        <w:rPr>
-          <w:i/>
-          <w:color w:val="595959"/>
-          <w:sz w:val="20"/>
-        </w:rPr>
-        <w:t>Rotativa não aplicada nesta conversa.</w:t>
-      </w:r>
-    </w:p>
-    <w:p>
-      <w:pPr>
-        <w:spacing w:before="280" w:after="80"/>
+        <w:spacing w:before="300" w:after="60"/>
       </w:pPr>
       <w:r>
         <w:rPr>
           <w:b/>
           <w:color w:val="C4122F"/>
-          <w:sz w:val="22"/>
+          <w:sz w:val="25"/>
         </w:rPr>
-        <w:t>3. PREPARAÇÃO PARA O MERCADO</w:t>
+        <w:t>Preparação para o mercado</w:t>
+      </w:r>
+    </w:p>
+    <w:p>
+      <w:r>
+        <w:rPr>
+          <w:color w:val="1A1A1A"/>
+        </w:rPr>
+        <w:t>Esse bloco eu pulei de propósito. Como ela não vai prestar PS de consultoria, nota de prontidão para MBB, GMAT, estruturação de case e fit não medem nada no caso dela.</w:t>
+      </w:r>
+    </w:p>
+    <w:p>
+      <w:r>
+        <w:rPr>
+          <w:color w:val="1A1A1A"/>
+        </w:rPr>
+        <w:t>A única dessas que eu ainda quero fazer é a de o que ela aprendeu a fazer desde que entrou, porque essa não depende de consultoria e mede o desenvolvimento dela pelos objetivos que ela mesma colocou.</w:t>
       </w:r>
     </w:p>
     <w:p>
       <w:pPr>
-        <w:spacing w:before="80" w:after="200"/>
-        <w:ind w:left="170"/>
-      </w:pPr>
-      <w:r>
-        <w:rPr>
-          <w:i/>
-          <w:color w:val="8E0C22"/>
-          <w:sz w:val="19"/>
-        </w:rPr>
-        <w:t>Bloco pulado de propósito: ela não vai prestar PS de consultoria, então nota de prontidão para MBB, GMAT, estruturação de case e fit não medem nada no caso dela.</w:t>
-      </w:r>
-    </w:p>
-    <w:p>
-      <w:pPr>
-        <w:spacing w:before="160" w:after="40"/>
-      </w:pPr>
-      <w:r>
-        <w:rPr>
-          <w:b/>
-          <w:color w:val="8E0C22"/>
-          <w:sz w:val="20"/>
-        </w:rPr>
-        <w:t xml:space="preserve">Q9  </w:t>
-      </w:r>
-      <w:r>
-        <w:rPr>
-          <w:b/>
-          <w:color w:val="1A1A1A"/>
-          <w:sz w:val="20"/>
-        </w:rPr>
-        <w:t>Numa escala de 0 a 10, quão pronto você se sente hoje para um PS de MBB?</w:t>
-      </w:r>
-    </w:p>
-    <w:p>
-      <w:pPr>
-        <w:spacing w:after="80"/>
-        <w:ind w:left="283"/>
-      </w:pPr>
-      <w:r>
-        <w:rPr>
-          <w:i/>
-          <w:color w:val="595959"/>
-          <w:sz w:val="20"/>
-        </w:rPr>
-        <w:t>Não se aplica: não pretende prestar PS de consultoria.</w:t>
-      </w:r>
-    </w:p>
-    <w:p>
-      <w:pPr>
-        <w:spacing w:before="160" w:after="40"/>
-      </w:pPr>
-      <w:r>
-        <w:rPr>
-          <w:b/>
-          <w:color w:val="8E0C22"/>
-          <w:sz w:val="20"/>
-        </w:rPr>
-        <w:t xml:space="preserve">Q10  </w:t>
-      </w:r>
-      <w:r>
-        <w:rPr>
-          <w:b/>
-          <w:color w:val="1A1A1A"/>
-          <w:sz w:val="20"/>
-        </w:rPr>
-        <w:t>O que você sabe fazer hoje que não sabia quando entrou? Me dá um exemplo concreto.</w:t>
-      </w:r>
-    </w:p>
-    <w:p>
-      <w:pPr>
-        <w:spacing w:after="80"/>
-        <w:ind w:left="283"/>
-      </w:pPr>
-      <w:r>
-        <w:rPr>
-          <w:i/>
-          <w:color w:val="595959"/>
-          <w:sz w:val="20"/>
-        </w:rPr>
-        <w:t>Sem registro. Vale recuperar na próxima conversa: esta pergunta não depende de consultoria e mede o desenvolvimento dela pelos próprios objetivos (business sense e repertório de estratégia).</w:t>
-      </w:r>
-    </w:p>
-    <w:p>
-      <w:pPr>
-        <w:spacing w:before="160" w:after="40"/>
-      </w:pPr>
-      <w:r>
-        <w:rPr>
-          <w:b/>
-          <w:color w:val="8E0C22"/>
-          <w:sz w:val="20"/>
-        </w:rPr>
-        <w:t xml:space="preserve">Q11  </w:t>
-      </w:r>
-      <w:r>
-        <w:rPr>
-          <w:b/>
-          <w:color w:val="1A1A1A"/>
-          <w:sz w:val="20"/>
-        </w:rPr>
-        <w:t>Onde você está no GMAT / estruturação de case / fit hoje, e qual dessas frentes está mais atrasada para o seu alvo?</w:t>
-      </w:r>
-    </w:p>
-    <w:p>
-      <w:pPr>
-        <w:spacing w:after="80"/>
-        <w:ind w:left="283"/>
-      </w:pPr>
-      <w:r>
-        <w:rPr>
-          <w:i/>
-          <w:color w:val="595959"/>
-          <w:sz w:val="20"/>
-        </w:rPr>
-        <w:t>Não se aplica: não há alvo de PS de consultoria.</w:t>
-      </w:r>
-    </w:p>
-    <w:p>
-      <w:pPr>
-        <w:spacing w:before="280" w:after="80"/>
+        <w:spacing w:before="300" w:after="60"/>
       </w:pPr>
       <w:r>
         <w:rPr>
           <w:b/>
           <w:color w:val="C4122F"/>
-          <w:sz w:val="22"/>
+          <w:sz w:val="25"/>
         </w:rPr>
-        <w:t>4. FUTURO NO CLUBE E RESPONSABILIDADE</w:t>
+        <w:t>Futuro no clube</w:t>
+      </w:r>
+    </w:p>
+    <w:p>
+      <w:r>
+        <w:rPr>
+          <w:color w:val="1A1A1A"/>
+        </w:rPr>
+        <w:t>Perguntei o que precisaria ter acontecido, olhando para o último semestre dela, para sentir que valeu. Ela respondeu que seria legal ter mais momentos de capacitação junto com as empresas, porque ajuda no business sense e na estratégia que permeiam a consultoria. Os pontos de contato com o pessoal do clube ajudariam muito.</w:t>
+      </w:r>
+    </w:p>
+    <w:p>
+      <w:r>
+        <w:rPr>
+          <w:color w:val="1A1A1A"/>
+        </w:rPr>
+        <w:t>Diretoria ela não quer, e o motivo é objetivo: é o último semestre dela em Campinas, depois vai para São Paulo.</w:t>
+      </w:r>
+    </w:p>
+    <w:p>
+      <w:r>
+        <w:rPr>
+          <w:color w:val="1A1A1A"/>
+        </w:rPr>
+        <w:t>Não coletei a nota de 0 a 10 de chance de continuar no clube. Faltou.</w:t>
       </w:r>
     </w:p>
     <w:p>
       <w:pPr>
-        <w:spacing w:before="160" w:after="40"/>
-      </w:pPr>
-      <w:r>
-        <w:rPr>
-          <w:b/>
-          <w:color w:val="8E0C22"/>
-          <w:sz w:val="20"/>
-        </w:rPr>
-        <w:t xml:space="preserve">Q12  </w:t>
-      </w:r>
-      <w:r>
-        <w:rPr>
-          <w:b/>
-          <w:color w:val="1A1A1A"/>
-          <w:sz w:val="20"/>
-        </w:rPr>
-        <w:t>Quando você imagina seu último semestre no clube, o que precisa ter acontecido para você olhar para trás e sentir que valeu? Que tipo de responsabilidade caberia nisso?</w:t>
-      </w:r>
-    </w:p>
-    <w:p>
-      <w:pPr>
-        <w:spacing w:after="80"/>
-        <w:ind w:left="283"/>
-      </w:pPr>
-      <w:r>
-        <w:rPr>
-          <w:color w:val="1A1A1A"/>
-          <w:sz w:val="21"/>
-        </w:rPr>
-        <w:t>Seria legal ter mais momentos de capacitação junto com as empresas em contato com o clube. Ajuda muito no business sense e na estratégia que permeiam a consultoria; os pontos de contato com o pessoal do clube ajudariam muito.</w:t>
-      </w:r>
-    </w:p>
-    <w:p>
-      <w:pPr>
-        <w:spacing w:before="160" w:after="40"/>
-      </w:pPr>
-      <w:r>
-        <w:rPr>
-          <w:b/>
-          <w:color w:val="8E0C22"/>
-          <w:sz w:val="20"/>
-        </w:rPr>
-        <w:t xml:space="preserve">Q13  </w:t>
-      </w:r>
-      <w:r>
-        <w:rPr>
-          <w:b/>
-          <w:color w:val="1A1A1A"/>
-          <w:sz w:val="20"/>
-        </w:rPr>
-        <w:t>Numa escala de 0 a 10, qual a chance de você continuar no clube no próximo semestre? O que subiria esse número em dois pontos?</w:t>
-      </w:r>
-    </w:p>
-    <w:p>
-      <w:pPr>
-        <w:spacing w:after="80"/>
-        <w:ind w:left="283"/>
-      </w:pPr>
-      <w:r>
-        <w:rPr>
-          <w:i/>
-          <w:color w:val="595959"/>
-          <w:sz w:val="20"/>
-        </w:rPr>
-        <w:t>Sem registro. É a nota de retenção do modelo e está em aberto. Ver Pendências.</w:t>
-      </w:r>
-    </w:p>
-    <w:p>
-      <w:pPr>
-        <w:spacing w:before="160" w:after="40"/>
-      </w:pPr>
-      <w:r>
-        <w:rPr>
-          <w:b/>
-          <w:color w:val="8E0C22"/>
-          <w:sz w:val="20"/>
-        </w:rPr>
-        <w:t xml:space="preserve">Q14  </w:t>
-      </w:r>
-      <w:r>
-        <w:rPr>
-          <w:b/>
-          <w:color w:val="1A1A1A"/>
-          <w:sz w:val="20"/>
-        </w:rPr>
-        <w:t>Você pensa em assumir um cargo de diretoria? Qual, e o que hoje pesa a favor e contra?</w:t>
-      </w:r>
-    </w:p>
-    <w:p>
-      <w:pPr>
-        <w:spacing w:after="80"/>
-        <w:ind w:left="283"/>
-      </w:pPr>
-      <w:r>
-        <w:rPr>
-          <w:color w:val="1A1A1A"/>
-          <w:sz w:val="21"/>
-        </w:rPr>
-        <w:t>Não. Como é o último semestre em Campinas, depois vai para São Paulo.</w:t>
-      </w:r>
-    </w:p>
-    <w:p>
-      <w:pPr>
-        <w:spacing w:before="280" w:after="80"/>
+        <w:spacing w:before="300" w:after="60"/>
       </w:pPr>
       <w:r>
         <w:rPr>
           <w:b/>
           <w:color w:val="C4122F"/>
-          <w:sz w:val="22"/>
+          <w:sz w:val="25"/>
         </w:rPr>
-        <w:t>5. FEEDBACK PARA A DIRETORIA</w:t>
+        <w:t>Feedback para a diretoria</w:t>
+      </w:r>
+    </w:p>
+    <w:p>
+      <w:r>
+        <w:rPr>
+          <w:color w:val="1A1A1A"/>
+        </w:rPr>
+        <w:t>Perguntei o que ela mudaria se fosse a diretora responsável por ela na semana seguinte. Ela disse que o Procópio já implementou tudo o que ela teria feito: criação de modelos e tudo organizado no Drive. Comentou que são momentos sazonais, e essa resposta ficou cortada na planilha.</w:t>
+      </w:r>
+    </w:p>
+    <w:p>
+      <w:r>
+        <w:rPr>
+          <w:color w:val="1A1A1A"/>
+        </w:rPr>
+        <w:t>Sobre o que a diretoria não está enxergando, ela pediu transparência do que acontece em cada área. Por conta do PS ela ficou um pouco perdida com os vídeos. Essa também ficou cortada.</w:t>
       </w:r>
     </w:p>
     <w:p>
       <w:pPr>
-        <w:spacing w:before="160" w:after="40"/>
-      </w:pPr>
-      <w:r>
-        <w:rPr>
-          <w:b/>
-          <w:color w:val="8E0C22"/>
-          <w:sz w:val="20"/>
-        </w:rPr>
-        <w:t xml:space="preserve">Q15  </w:t>
-      </w:r>
-      <w:r>
-        <w:rPr>
-          <w:b/>
-          <w:color w:val="1A1A1A"/>
-          <w:sz w:val="20"/>
-        </w:rPr>
-        <w:t>Se você fosse o diretor responsável por você na semana que vem, qual seria a primeira coisa que mudaria na forma como a sua área é conduzida?</w:t>
-      </w:r>
-    </w:p>
-    <w:p>
-      <w:pPr>
-        <w:spacing w:after="80"/>
-        <w:ind w:left="283"/>
-      </w:pPr>
-      <w:r>
-        <w:rPr>
-          <w:color w:val="1A1A1A"/>
-          <w:sz w:val="21"/>
-        </w:rPr>
-        <w:t>O Procópio conseguiu implementar tudo o que ela teria implementado: criação de modelos, deixar tudo organizado no Drive. Comenta que são momentos sazonais. [resposta truncada na planilha]</w:t>
-      </w:r>
-    </w:p>
-    <w:p>
-      <w:pPr>
-        <w:spacing w:before="160" w:after="40"/>
-      </w:pPr>
-      <w:r>
-        <w:rPr>
-          <w:b/>
-          <w:color w:val="8E0C22"/>
-          <w:sz w:val="20"/>
-        </w:rPr>
-        <w:t xml:space="preserve">Q16  </w:t>
-      </w:r>
-      <w:r>
-        <w:rPr>
-          <w:b/>
-          <w:color w:val="1A1A1A"/>
-          <w:sz w:val="20"/>
-        </w:rPr>
-        <w:t>O que você sente que a diretoria não está enxergando hoje, sobre você, sobre sua área ou sobre o clube, que faria diferença se a gente soubesse?</w:t>
-      </w:r>
-    </w:p>
-    <w:p>
-      <w:pPr>
-        <w:spacing w:after="80"/>
-        <w:ind w:left="283"/>
-      </w:pPr>
-      <w:r>
-        <w:rPr>
-          <w:color w:val="1A1A1A"/>
-          <w:sz w:val="21"/>
-        </w:rPr>
-        <w:t>Ter transparência do que está acontecendo em cada área. Por conta do PS, ela ficou um pouco perdida com os vídeos. [resposta truncada na planilha]</w:t>
-      </w:r>
-    </w:p>
-    <w:p>
-      <w:pPr>
-        <w:spacing w:before="280" w:after="80"/>
+        <w:spacing w:before="300" w:after="60"/>
       </w:pPr>
       <w:r>
         <w:rPr>
           <w:b/>
           <w:color w:val="C4122F"/>
-          <w:sz w:val="22"/>
+          <w:sz w:val="25"/>
         </w:rPr>
-        <w:t>LEITURA DA CONVERSA</w:t>
+        <w:t>O que eu tirei da conversa</w:t>
+      </w:r>
+    </w:p>
+    <w:p>
+      <w:r>
+        <w:rPr>
+          <w:color w:val="1A1A1A"/>
+        </w:rPr>
+        <w:t>Ela está satisfeita e sem atrito com a área. O feedback ao Procópio não é elogio genérico: é específico, e ela chega a dizer que ele implementou o que ela mesma faria.</w:t>
+      </w:r>
+    </w:p>
+    <w:p>
+      <w:r>
+        <w:rPr>
+          <w:color w:val="1A1A1A"/>
+        </w:rPr>
+        <w:t>O objetivo dela não é consultoria, e isso é legítimo. Só significa que o acompanhamento dela tem que medir outra coisa. Prontidão para PS não diz nada aqui.</w:t>
+      </w:r>
+    </w:p>
+    <w:p>
+      <w:r>
+        <w:rPr>
+          <w:color w:val="1A1A1A"/>
+        </w:rPr>
+        <w:t>Os dois pedidos que ela trouxe são acionáveis: mais capacitação junto com as empresas e transparência do que cada área está fazendo.</w:t>
+      </w:r>
+    </w:p>
+    <w:p>
+      <w:r>
+        <w:rPr>
+          <w:color w:val="1A1A1A"/>
+        </w:rPr>
+        <w:t>Uma coisa que eu preciso confirmar com ela: diz que este é o último semestre em Campinas e que vai para São Paulo, mas colocou o horizonte de saída no segundo semestre de 2027 e disse que a rotina do clube não atrapalha. Pode ser que pretenda continuar de longe, mas isso não ficou claro, e eu não peguei a nota de retenção.</w:t>
+      </w:r>
+    </w:p>
+    <w:p>
+      <w:pPr>
+        <w:spacing w:before="300" w:after="60"/>
+      </w:pPr>
+      <w:r>
+        <w:rPr>
+          <w:b/>
+          <w:color w:val="C4122F"/>
+          <w:sz w:val="25"/>
+        </w:rPr>
+        <w:t>Pendências</w:t>
       </w:r>
     </w:p>
     <w:p>
       <w:pPr>
         <w:pStyle w:val="ListBullet"/>
-        <w:spacing w:after="60"/>
+        <w:spacing w:after="80"/>
       </w:pPr>
       <w:r>
-        <w:rPr>
-          <w:sz w:val="21"/>
-        </w:rPr>
-        <w:t>Membro satisfeito e sem atrito com a área: o feedback ao Procópio é positivo e específico (organização no Notion, modelos, Drive). Ela chega a dizer que ele implementou o que ela mesma faria.</w:t>
+        <w:t>Pegar a nota de chance de continuar no clube.</w:t>
       </w:r>
     </w:p>
     <w:p>
       <w:pPr>
         <w:pStyle w:val="ListBullet"/>
-        <w:spacing w:after="60"/>
+        <w:spacing w:after="80"/>
       </w:pPr>
       <w:r>
-        <w:rPr>
-          <w:sz w:val="21"/>
-        </w:rPr>
-        <w:t>O objetivo dela é legítimo e não é consultoria: business sense, repertório de estratégia e networking. O acompanhamento precisa medir isso, não prontidão para PS.</w:t>
+        <w:t>Fazer a pergunta do que ela aprendeu desde que entrou.</w:t>
       </w:r>
     </w:p>
     <w:p>
       <w:pPr>
         <w:pStyle w:val="ListBullet"/>
-        <w:spacing w:after="60"/>
+        <w:spacing w:after="80"/>
       </w:pPr>
       <w:r>
-        <w:rPr>
-          <w:sz w:val="21"/>
-        </w:rPr>
-        <w:t>Dois pedidos concretos e acionáveis: mais capacitação em conjunto com as empresas, e transparência do que cada área está fazendo, porque ela se perdeu durante o PS.</w:t>
+        <w:t>Completar as três respostas que ficaram cortadas na planilha.</w:t>
       </w:r>
     </w:p>
     <w:p>
       <w:pPr>
         <w:pStyle w:val="ListBullet"/>
-        <w:spacing w:after="60"/>
+        <w:spacing w:after="80"/>
       </w:pPr>
       <w:r>
-        <w:rPr>
-          <w:sz w:val="21"/>
-        </w:rPr>
-        <w:t>Crítica de processo, não de pessoa: reuniões curtas que poderiam ser alinhadas por mensagem, e incluir as responsáveis do CWC desde o início para não depender de informação repassada.</w:t>
-      </w:r>
-    </w:p>
-    <w:p>
-      <w:pPr>
-        <w:pStyle w:val="ListBullet"/>
-        <w:spacing w:after="60"/>
-      </w:pPr>
-      <w:r>
-        <w:rPr>
-          <w:sz w:val="21"/>
-        </w:rPr>
-        <w:t>Ponto de atenção sobre permanência: diz que este é o último semestre em Campinas e que vai para São Paulo, mas coloca o horizonte de saída no 2º semestre de 2027 e afirma que a rotina do clube não atrapalha. As duas coisas podem conviver (participação remota), mas convém confirmar explicitamente.</w:t>
-      </w:r>
-    </w:p>
-    <w:p>
-      <w:pPr>
-        <w:spacing w:before="280" w:after="80"/>
-      </w:pPr>
-      <w:r>
-        <w:rPr>
-          <w:b/>
-          <w:color w:val="C4122F"/>
-          <w:sz w:val="22"/>
-        </w:rPr>
-        <w:t>PENDÊNCIAS</w:t>
-      </w:r>
-    </w:p>
-    <w:p>
-      <w:pPr>
-        <w:pStyle w:val="ListBullet"/>
-        <w:spacing w:after="60"/>
-      </w:pPr>
-      <w:r>
-        <w:rPr>
-          <w:sz w:val="21"/>
-        </w:rPr>
-        <w:t>Nota de chance de continuar no clube (Q13) não foi registrada, e é justamente a nota que dispara conversa de retenção quando fica em 6 ou menos, e no caso dela a mudança para São Paulo é uma variável real. Vale coletar.</w:t>
-      </w:r>
-    </w:p>
-    <w:p>
-      <w:pPr>
-        <w:pStyle w:val="ListBullet"/>
-        <w:spacing w:after="60"/>
-      </w:pPr>
-      <w:r>
-        <w:rPr>
-          <w:sz w:val="21"/>
-        </w:rPr>
-        <w:t>Q10 ficou sem registro e não depende de consultoria: pode entrar na próxima conversa como medida de desenvolvimento dela.</w:t>
-      </w:r>
-    </w:p>
-    <w:p>
-      <w:pPr>
-        <w:pStyle w:val="ListBullet"/>
-        <w:spacing w:after="60"/>
-      </w:pPr>
-      <w:r>
-        <w:rPr>
-          <w:sz w:val="21"/>
-        </w:rPr>
-        <w:t>Duas respostas estão truncadas na planilha (Q15 e Q16) e uma frase do cadastro também (horizonte de saída). Completar antes de arquivar.</w:t>
-      </w:r>
-    </w:p>
-    <w:p>
-      <w:pPr>
-        <w:pStyle w:val="ListBullet"/>
-        <w:spacing w:after="60"/>
-      </w:pPr>
-      <w:r>
-        <w:rPr>
-          <w:sz w:val="21"/>
-        </w:rPr>
-        <w:t>Combinado com a Clarissa: nada registrado. Definir um próximo passo concreto, já que ela trouxe dois pedidos claros.</w:t>
+        <w:t>Definir um combinado com ela, porque não ficou nada marcado.</w:t>
       </w:r>
     </w:p>
     <w:sectPr>
+      <w:headerReference w:type="default" r:id="rId9"/>
       <w:pgSz w:w="12240" w:h="15840"/>
-      <w:pgMar w:top="1134" w:right="1247" w:bottom="1134" w:left="1247" w:header="720" w:footer="720" w:gutter="0"/>
+      <w:pgMar w:top="907" w:right="1361" w:bottom="1134" w:left="1361" w:header="720" w:footer="720" w:gutter="0"/>
       <w:cols w:space="720"/>
       <w:docGrid w:linePitch="360"/>
     </w:sectPr>
   </w:body>
 </w:document>
+</file>
+
+<file path=word/header1.xml><?xml version="1.0" encoding="utf-8"?>
+<w:hdr xmlns:m="http://schemas.openxmlformats.org/officeDocument/2006/math" xmlns:mc="http://schemas.openxmlformats.org/markup-compatibility/2006" xmlns:mo="http://schemas.microsoft.com/office/mac/office/2008/main" xmlns:mv="urn:schemas-microsoft-com:mac:vml" xmlns:o="urn:schemas-microsoft-com:office:office" xmlns:r="http://schemas.openxmlformats.org/officeDocument/2006/relationships" xmlns:v="urn:schemas-microsoft-com:vml" xmlns:w10="urn:schemas-microsoft-com:office:word" xmlns:w14="http://schemas.microsoft.com/office/word/2010/wordml" xmlns:w="http://schemas.openxmlformats.org/wordprocessingml/2006/main" xmlns:wne="http://schemas.microsoft.com/office/word/2006/wordml" xmlns:wp14="http://schemas.microsoft.com/office/word/2010/wordprocessingDrawing" xmlns:wp="http://schemas.openxmlformats.org/drawingml/2006/wordprocessingDrawing" xmlns:wpc="http://schemas.microsoft.com/office/word/2010/wordprocessingCanvas" xmlns:wpg="http://schemas.microsoft.com/office/word/2010/wordprocessingGroup" xmlns:wpi="http://schemas.microsoft.com/office/word/2010/wordprocessingInk" xmlns:wps="http://schemas.microsoft.com/office/word/2010/wordprocessingShape" mc:Ignorable="w14 wp14">
+  <w:p>
+    <w:pPr>
+      <w:pStyle w:val="Header"/>
+      <w:spacing w:after="40"/>
+      <w:jc w:val="left"/>
+    </w:pPr>
+    <w:r>
+      <w:drawing>
+        <wp:inline xmlns:a="http://schemas.openxmlformats.org/drawingml/2006/main" xmlns:pic="http://schemas.openxmlformats.org/drawingml/2006/picture">
+          <wp:extent cx="936000" cy="449106"/>
+          <wp:docPr id="1" name="Picture 1"/>
+          <wp:cNvGraphicFramePr>
+            <a:graphicFrameLocks noChangeAspect="1"/>
+          </wp:cNvGraphicFramePr>
+          <a:graphic>
+            <a:graphicData uri="http://schemas.openxmlformats.org/drawingml/2006/picture">
+              <pic:pic>
+                <pic:nvPicPr>
+                  <pic:cNvPr id="0" name="logo_icon.png"/>
+                  <pic:cNvPicPr/>
+                </pic:nvPicPr>
+                <pic:blipFill>
+                  <a:blip r:embed="rId1"/>
+                  <a:stretch>
+                    <a:fillRect/>
+                  </a:stretch>
+                </pic:blipFill>
+                <pic:spPr>
+                  <a:xfrm>
+                    <a:off x="0" y="0"/>
+                    <a:ext cx="936000" cy="449106"/>
+                  </a:xfrm>
+                  <a:prstGeom prst="rect"/>
+                </pic:spPr>
+              </pic:pic>
+            </a:graphicData>
+          </a:graphic>
+        </wp:inline>
+      </w:drawing>
+    </w:r>
+  </w:p>
+</w:hdr>
 </file>
 
 <file path=word/numbering.xml><?xml version="1.0" encoding="utf-8"?>
@@ -1442,11 +885,11 @@
     <w:qFormat/>
     <w:rsid w:val="00FC693F"/>
     <w:pPr>
-      <w:spacing w:after="120"/>
+      <w:spacing w:after="160" w:line="276" w:lineRule="auto"/>
     </w:pPr>
     <w:rPr>
       <w:rFonts w:ascii="Calibri" w:hAnsi="Calibri"/>
-      <w:sz w:val="21"/>
+      <w:sz w:val="22"/>
     </w:rPr>
   </w:style>
   <w:style w:type="paragraph" w:styleId="Header">

</xml_diff>

<commit_message>
Volta a estrutura original dos registros 1on1, mantendo linguagem natural
- Restaura blocos numerados, codigos Q1..Q16 com a pergunta na integra,
  tabelas de perfil e notas, e as listas de leitura e pendencias
- Mantem o texto das respostas e das analises em linguagem propria, em
  primeira pessoa, sem registro de relatorio gerado
- Logo do CCU no cabecalho e nenhum travessao
</commit_message>
<xml_diff>
--- a/1on1/1on1 - Clarissa.docx
+++ b/1on1/1on1 - Clarissa.docx
@@ -4,470 +4,1074 @@
   <w:body>
     <w:p>
       <w:pPr>
-        <w:spacing w:after="20"/>
+        <w:spacing w:after="40"/>
       </w:pPr>
       <w:r>
         <w:rPr>
           <w:b/>
           <w:color w:val="C4122F"/>
-          <w:sz w:val="38"/>
+          <w:sz w:val="40"/>
         </w:rPr>
         <w:t>1on1 com Clarissa</w:t>
       </w:r>
     </w:p>
     <w:p>
       <w:pPr>
-        <w:spacing w:after="240"/>
+        <w:spacing w:after="200"/>
       </w:pPr>
       <w:r>
         <w:rPr>
           <w:i/>
-          <w:color w:val="5A5A5A"/>
+          <w:color w:val="595959"/>
           <w:sz w:val="19"/>
         </w:rPr>
-        <w:t>Anotações da conversa · Clube de Consultoria Universitário</w:t>
-      </w:r>
-    </w:p>
-    <w:p>
-      <w:r>
-        <w:rPr>
-          <w:color w:val="1A1A1A"/>
-        </w:rPr>
-        <w:t>Clarissa é da Farmácia, está no 8º semestre, tem 22 anos e entrou no último PS. Está na Comunicação.</w:t>
-      </w:r>
-    </w:p>
-    <w:p>
-      <w:r>
-        <w:rPr>
-          <w:color w:val="1A1A1A"/>
-        </w:rPr>
-        <w:t>Antes de qualquer coisa, uma observação para quem for ler isso depois: ela não pretende prestar processo seletivo de consultoria. O que ela quer do clube é repertório de estratégia, business sense e networking. Por isso pulei as perguntas de preparação e de empresas, que não fariam sentido no caso dela. Onde eu escrevi que não se aplica, não é resposta faltando.</w:t>
+        <w:t>Anotações da conversa · Clube de Consultoria Universitário · fonte: Acompanhamento 1on1 CCU</w:t>
       </w:r>
     </w:p>
     <w:p>
       <w:pPr>
-        <w:spacing w:before="300" w:after="60"/>
+        <w:spacing w:before="80" w:after="200"/>
+        <w:ind w:left="170"/>
+      </w:pPr>
+      <w:r>
+        <w:rPr>
+          <w:i/>
+          <w:color w:val="8E0C22"/>
+          <w:sz w:val="19"/>
+        </w:rPr>
+        <w:t>Antes de tudo, uma observação para quem for ler isso depois: a Clarissa não pretende prestar processo seletivo de consultoria. O que ela quer do clube é repertório de estratégia, business sense e networking. Por isso eu pulei as perguntas de preparação e de empresas, que não fariam sentido no caso dela. Onde está escrito que não se aplica, não é resposta faltando.</w:t>
+      </w:r>
+    </w:p>
+    <w:p>
+      <w:pPr>
+        <w:spacing w:before="280" w:after="80"/>
       </w:pPr>
       <w:r>
         <w:rPr>
           <w:b/>
           <w:color w:val="C4122F"/>
-          <w:sz w:val="25"/>
+          <w:sz w:val="22"/>
         </w:rPr>
-        <w:t>O básico</w:t>
+        <w:t>PERFIL</w:t>
       </w:r>
+    </w:p>
+    <w:tbl>
+      <w:tblPr>
+        <w:tblStyle w:val="LightList-Accent1"/>
+        <w:tblW w:type="auto" w:w="0"/>
+        <w:jc w:val="left"/>
+        <w:tblLook w:firstColumn="1" w:firstRow="1" w:lastColumn="0" w:lastRow="0" w:noHBand="0" w:noVBand="1" w:val="04A0"/>
+      </w:tblPr>
+      <w:tblGrid>
+        <w:gridCol w:w="4873"/>
+        <w:gridCol w:w="4873"/>
+      </w:tblGrid>
+      <w:tr>
+        <w:tc>
+          <w:tcPr>
+            <w:tcW w:type="dxa" w:w="2608"/>
+          </w:tcPr>
+          <w:p>
+            <w:r>
+              <w:rPr>
+                <w:b/>
+                <w:sz w:val="19"/>
+              </w:rPr>
+              <w:t>Curso, período e idade</w:t>
+            </w:r>
+          </w:p>
+        </w:tc>
+        <w:tc>
+          <w:tcPr>
+            <w:tcW w:type="dxa" w:w="6803"/>
+          </w:tcPr>
+          <w:p>
+            <w:r>
+              <w:rPr>
+                <w:sz w:val="19"/>
+              </w:rPr>
+              <w:t>Farmácia, 8º semestre, 22 anos</w:t>
+            </w:r>
+          </w:p>
+        </w:tc>
+      </w:tr>
+      <w:tr>
+        <w:tc>
+          <w:tcPr>
+            <w:tcW w:type="dxa" w:w="2608"/>
+          </w:tcPr>
+          <w:p>
+            <w:r>
+              <w:rPr>
+                <w:b/>
+                <w:sz w:val="19"/>
+              </w:rPr>
+              <w:t>Tempo de clube</w:t>
+            </w:r>
+          </w:p>
+        </w:tc>
+        <w:tc>
+          <w:tcPr>
+            <w:tcW w:type="dxa" w:w="6803"/>
+          </w:tcPr>
+          <w:p>
+            <w:r>
+              <w:rPr>
+                <w:sz w:val="19"/>
+              </w:rPr>
+              <w:t>Entrou no último PS</w:t>
+            </w:r>
+          </w:p>
+        </w:tc>
+      </w:tr>
+      <w:tr>
+        <w:tc>
+          <w:tcPr>
+            <w:tcW w:type="dxa" w:w="2608"/>
+          </w:tcPr>
+          <w:p>
+            <w:r>
+              <w:rPr>
+                <w:b/>
+                <w:sz w:val="19"/>
+              </w:rPr>
+              <w:t>Área</w:t>
+            </w:r>
+          </w:p>
+        </w:tc>
+        <w:tc>
+          <w:tcPr>
+            <w:tcW w:type="dxa" w:w="6803"/>
+          </w:tcPr>
+          <w:p>
+            <w:r>
+              <w:rPr>
+                <w:sz w:val="19"/>
+              </w:rPr>
+              <w:t>Comunicação</w:t>
+            </w:r>
+          </w:p>
+        </w:tc>
+      </w:tr>
+      <w:tr>
+        <w:tc>
+          <w:tcPr>
+            <w:tcW w:type="dxa" w:w="2608"/>
+          </w:tcPr>
+          <w:p>
+            <w:r>
+              <w:rPr>
+                <w:b/>
+                <w:sz w:val="19"/>
+              </w:rPr>
+              <w:t>PS de consultoria</w:t>
+            </w:r>
+          </w:p>
+        </w:tc>
+        <w:tc>
+          <w:tcPr>
+            <w:tcW w:type="dxa" w:w="6803"/>
+          </w:tcPr>
+          <w:p>
+            <w:r>
+              <w:rPr>
+                <w:sz w:val="19"/>
+              </w:rPr>
+              <w:t>Não pretende prestar. Quer algo mais voltado para estratégia, e é esse o interesse dela no clube</w:t>
+            </w:r>
+          </w:p>
+        </w:tc>
+      </w:tr>
+      <w:tr>
+        <w:tc>
+          <w:tcPr>
+            <w:tcW w:type="dxa" w:w="2608"/>
+          </w:tcPr>
+          <w:p>
+            <w:r>
+              <w:rPr>
+                <w:b/>
+                <w:sz w:val="19"/>
+              </w:rPr>
+              <w:t>Estágio e summer</w:t>
+            </w:r>
+          </w:p>
+        </w:tc>
+        <w:tc>
+          <w:tcPr>
+            <w:tcW w:type="dxa" w:w="6803"/>
+          </w:tcPr>
+          <w:p>
+            <w:r>
+              <w:rPr>
+                <w:sz w:val="19"/>
+              </w:rPr>
+              <w:t>Pensa em fazer estágio, mas voltado para a farmácia</w:t>
+            </w:r>
+          </w:p>
+        </w:tc>
+      </w:tr>
+      <w:tr>
+        <w:tc>
+          <w:tcPr>
+            <w:tcW w:type="dxa" w:w="2608"/>
+          </w:tcPr>
+          <w:p>
+            <w:r>
+              <w:rPr>
+                <w:b/>
+                <w:sz w:val="19"/>
+              </w:rPr>
+              <w:t>Objetivo com o clube</w:t>
+            </w:r>
+          </w:p>
+        </w:tc>
+        <w:tc>
+          <w:tcPr>
+            <w:tcW w:type="dxa" w:w="6803"/>
+          </w:tcPr>
+          <w:p>
+            <w:r>
+              <w:rPr>
+                <w:sz w:val="19"/>
+              </w:rPr>
+              <w:t>Raciocínio de consultor e business sense, além do networking, que ela sente que o clube estimula muito</w:t>
+            </w:r>
+          </w:p>
+        </w:tc>
+      </w:tr>
+      <w:tr>
+        <w:tc>
+          <w:tcPr>
+            <w:tcW w:type="dxa" w:w="2608"/>
+          </w:tcPr>
+          <w:p>
+            <w:r>
+              <w:rPr>
+                <w:b/>
+                <w:sz w:val="19"/>
+              </w:rPr>
+              <w:t>Horizonte de saída</w:t>
+            </w:r>
+          </w:p>
+        </w:tc>
+        <w:tc>
+          <w:tcPr>
+            <w:tcW w:type="dxa" w:w="6803"/>
+          </w:tcPr>
+          <w:p>
+            <w:r>
+              <w:rPr>
+                <w:sz w:val="19"/>
+              </w:rPr>
+              <w:t>A rotina do clube não atrapalha a dela. Acredita que fica até o segundo semestre de 2027</w:t>
+            </w:r>
+          </w:p>
+        </w:tc>
+      </w:tr>
+      <w:tr>
+        <w:tc>
+          <w:tcPr>
+            <w:tcW w:type="dxa" w:w="2608"/>
+          </w:tcPr>
+          <w:p>
+            <w:r>
+              <w:rPr>
+                <w:b/>
+                <w:sz w:val="19"/>
+              </w:rPr>
+              <w:t>Cargo de diretoria</w:t>
+            </w:r>
+          </w:p>
+        </w:tc>
+        <w:tc>
+          <w:tcPr>
+            <w:tcW w:type="dxa" w:w="6803"/>
+          </w:tcPr>
+          <w:p>
+            <w:r>
+              <w:rPr>
+                <w:sz w:val="19"/>
+              </w:rPr>
+              <w:t>Não pretende, porque é o último semestre em Campinas e depois vai para São Paulo</w:t>
+            </w:r>
+          </w:p>
+        </w:tc>
+      </w:tr>
+    </w:tbl>
+    <w:p>
+      <w:pPr>
+        <w:spacing w:after="40"/>
+      </w:pPr>
     </w:p>
     <w:p>
       <w:pPr>
-        <w:spacing w:after="60"/>
-      </w:pPr>
-      <w:r>
-        <w:rPr>
-          <w:b/>
-          <w:sz w:val="21"/>
-        </w:rPr>
-        <w:t xml:space="preserve">Curso e período: </w:t>
-      </w:r>
-      <w:r>
-        <w:rPr>
-          <w:sz w:val="21"/>
-        </w:rPr>
-        <w:t>Farmácia, 8º semestre, 22 anos</w:t>
-      </w:r>
-    </w:p>
-    <w:p>
-      <w:pPr>
-        <w:spacing w:after="60"/>
-      </w:pPr>
-      <w:r>
-        <w:rPr>
-          <w:b/>
-          <w:sz w:val="21"/>
-        </w:rPr>
-        <w:t xml:space="preserve">Tempo de clube: </w:t>
-      </w:r>
-      <w:r>
-        <w:rPr>
-          <w:sz w:val="21"/>
-        </w:rPr>
-        <w:t>entrou no último PS</w:t>
-      </w:r>
-    </w:p>
-    <w:p>
-      <w:pPr>
-        <w:spacing w:after="60"/>
-      </w:pPr>
-      <w:r>
-        <w:rPr>
-          <w:b/>
-          <w:sz w:val="21"/>
-        </w:rPr>
-        <w:t xml:space="preserve">PS de consultoria: </w:t>
-      </w:r>
-      <w:r>
-        <w:rPr>
-          <w:sz w:val="21"/>
-        </w:rPr>
-        <w:t>não pretende prestar, quer algo mais voltado para estratégia</w:t>
-      </w:r>
-    </w:p>
-    <w:p>
-      <w:pPr>
-        <w:spacing w:after="60"/>
-      </w:pPr>
-      <w:r>
-        <w:rPr>
-          <w:b/>
-          <w:sz w:val="21"/>
-        </w:rPr>
-        <w:t xml:space="preserve">Estágio: </w:t>
-      </w:r>
-      <w:r>
-        <w:rPr>
-          <w:sz w:val="21"/>
-        </w:rPr>
-        <w:t>pensa em fazer, mas voltado para a farmácia</w:t>
-      </w:r>
-    </w:p>
-    <w:p>
-      <w:pPr>
-        <w:spacing w:after="60"/>
-      </w:pPr>
-      <w:r>
-        <w:rPr>
-          <w:b/>
-          <w:sz w:val="21"/>
-        </w:rPr>
-        <w:t xml:space="preserve">Objetivo com o clube: </w:t>
-      </w:r>
-      <w:r>
-        <w:rPr>
-          <w:sz w:val="21"/>
-        </w:rPr>
-        <w:t>raciocínio de consultor, business sense e networking</w:t>
-      </w:r>
-    </w:p>
-    <w:p>
-      <w:pPr>
-        <w:spacing w:after="60"/>
-      </w:pPr>
-      <w:r>
-        <w:rPr>
-          <w:b/>
-          <w:sz w:val="21"/>
-        </w:rPr>
-        <w:t xml:space="preserve">Horizonte de saída: </w:t>
-      </w:r>
-      <w:r>
-        <w:rPr>
-          <w:sz w:val="21"/>
-        </w:rPr>
-        <w:t>acredita que fica até o segundo semestre de 2027</w:t>
-      </w:r>
-    </w:p>
-    <w:p>
-      <w:pPr>
-        <w:spacing w:after="60"/>
-      </w:pPr>
-      <w:r>
-        <w:rPr>
-          <w:b/>
-          <w:sz w:val="21"/>
-        </w:rPr>
-        <w:t xml:space="preserve">Diretoria: </w:t>
-      </w:r>
-      <w:r>
-        <w:rPr>
-          <w:sz w:val="21"/>
-        </w:rPr>
-        <w:t>não pretende assumir</w:t>
-      </w:r>
-    </w:p>
-    <w:p>
-      <w:pPr>
-        <w:spacing w:before="300" w:after="60"/>
+        <w:spacing w:before="280" w:after="80"/>
       </w:pPr>
       <w:r>
         <w:rPr>
           <w:b/>
           <w:color w:val="C4122F"/>
-          <w:sz w:val="25"/>
+          <w:sz w:val="22"/>
         </w:rPr>
-        <w:t>Como está sendo para ela estar aqui</w:t>
-      </w:r>
-    </w:p>
-    <w:p>
-      <w:r>
-        <w:rPr>
-          <w:color w:val="1A1A1A"/>
-        </w:rPr>
-        <w:t>Perguntei o que ela venderia com orgulho da área dela para um candidato do próximo PS, e o que avisaria antes. Ela disse que a comunicação é a ponte principal entre as empresas, o clube e a comunidade. O aviso é que vai mexer muito com Canva e marketing social, então quem curte isso vai gostar bastante.</w:t>
-      </w:r>
-    </w:p>
-    <w:p>
-      <w:r>
-        <w:rPr>
-          <w:color w:val="1A1A1A"/>
-        </w:rPr>
-        <w:t>Sobre o que o clube entregou de mais útil nos últimos dois meses, ela falou das palestras e das visitas presenciais, do contato com as empresas. Perda de tempo ela não aponta nada, mas acha que algumas reuniões poderiam ser resolvidas por mensagem. Às vezes são tão curtas que acabam ficando maçantes.</w:t>
-      </w:r>
-    </w:p>
-    <w:p>
-      <w:r>
-        <w:rPr>
-          <w:color w:val="1A1A1A"/>
-        </w:rPr>
-        <w:t>Perguntei se está satisfeita com a área. Está, e o motivo é concreto: sente que o Procópio conseguiu organizar bem as coisas. Quando ela chegou, achava os recursos meio perdidos, e hoje está tudo mais arrumado no Notion, com o suporte dele.</w:t>
+        <w:t>1. COMO ESTÁ SENDO ESTAR AQUI</w:t>
       </w:r>
     </w:p>
     <w:p>
       <w:pPr>
-        <w:spacing w:after="160"/>
+        <w:spacing w:before="160" w:after="40"/>
+      </w:pPr>
+      <w:r>
+        <w:rPr>
+          <w:b/>
+          <w:color w:val="8E0C22"/>
+          <w:sz w:val="20"/>
+        </w:rPr>
+        <w:t xml:space="preserve">Q1  </w:t>
+      </w:r>
+      <w:r>
+        <w:rPr>
+          <w:b/>
+          <w:color w:val="1A1A1A"/>
+          <w:sz w:val="20"/>
+        </w:rPr>
+        <w:t>Se você tivesse que descrever sua área para um candidato do próximo PS, o que você venderia com orgulho e o que você avisaria antes que ele entrasse?</w:t>
+      </w:r>
+    </w:p>
+    <w:p>
+      <w:pPr>
+        <w:spacing w:after="80"/>
+        <w:ind w:left="283"/>
+      </w:pPr>
+      <w:r>
+        <w:rPr>
+          <w:color w:val="1A1A1A"/>
+          <w:sz w:val="21"/>
+        </w:rPr>
+        <w:t>Ela falou que a comunicação é a ponte principal entre as empresas, o clube e a comunidade. O aviso que daria é que vai mexer muito com Canva e marketing social, então quem curte isso vai gostar bastante.</w:t>
+      </w:r>
+    </w:p>
+    <w:p>
+      <w:pPr>
+        <w:spacing w:before="160" w:after="40"/>
+      </w:pPr>
+      <w:r>
+        <w:rPr>
+          <w:b/>
+          <w:color w:val="8E0C22"/>
+          <w:sz w:val="20"/>
+        </w:rPr>
+        <w:t xml:space="preserve">Q2  </w:t>
+      </w:r>
+      <w:r>
+        <w:rPr>
+          <w:b/>
+          <w:color w:val="1A1A1A"/>
+          <w:sz w:val="20"/>
+        </w:rPr>
+        <w:t>Qual foi a coisa mais útil que o clube te entregou nos últimos dois meses, e qual foi a que mais te pareceu perda de tempo?</w:t>
+      </w:r>
+    </w:p>
+    <w:p>
+      <w:pPr>
+        <w:spacing w:after="80"/>
+        <w:ind w:left="283"/>
+      </w:pPr>
+      <w:r>
+        <w:rPr>
+          <w:color w:val="1A1A1A"/>
+          <w:sz w:val="21"/>
+        </w:rPr>
+        <w:t>Ela gosta muito das palestras e das visitas presenciais, do contato com as empresas. Perda de tempo ela não aponta nada, mas acha que algumas reuniões poderiam ser resolvidas por mensagem, porque às vezes são tão curtas que acabam ficando maçantes.</w:t>
+      </w:r>
+    </w:p>
+    <w:p>
+      <w:pPr>
+        <w:spacing w:before="160" w:after="40"/>
+      </w:pPr>
+      <w:r>
+        <w:rPr>
+          <w:b/>
+          <w:color w:val="8E0C22"/>
+          <w:sz w:val="20"/>
+        </w:rPr>
+        <w:t xml:space="preserve">Q3  </w:t>
+      </w:r>
+      <w:r>
+        <w:rPr>
+          <w:b/>
+          <w:color w:val="1A1A1A"/>
+          <w:sz w:val="20"/>
+        </w:rPr>
+        <w:t>Você está satisfeito com a sua área? O que ela faz bem, o que deixa a desejar, e o que precisaria acontecer para você pensar em trocar?</w:t>
+      </w:r>
+    </w:p>
+    <w:p>
+      <w:pPr>
+        <w:spacing w:after="80"/>
+        <w:ind w:left="283"/>
+      </w:pPr>
+      <w:r>
+        <w:rPr>
+          <w:color w:val="1A1A1A"/>
+          <w:sz w:val="21"/>
+        </w:rPr>
+        <w:t>Está satisfeita, e o motivo é concreto: sente que o Procópio organizou bem as coisas. Quando ela chegou, achava os recursos meio perdidos, e hoje está tudo mais arrumado no Notion, com o suporte dele.</w:t>
+      </w:r>
+    </w:p>
+    <w:p>
+      <w:pPr>
+        <w:spacing w:before="160" w:after="40"/>
+      </w:pPr>
+      <w:r>
+        <w:rPr>
+          <w:b/>
+          <w:color w:val="8E0C22"/>
+          <w:sz w:val="20"/>
+        </w:rPr>
+        <w:t xml:space="preserve">Q4  </w:t>
+      </w:r>
+      <w:r>
+        <w:rPr>
+          <w:b/>
+          <w:color w:val="1A1A1A"/>
+          <w:sz w:val="20"/>
+        </w:rPr>
+        <w:t>Como você descreveria o clima da sua área hoje? Tem alguém que te puxa para cima e algo que costuma te desanimar?</w:t>
+      </w:r>
+    </w:p>
+    <w:p>
+      <w:pPr>
+        <w:spacing w:after="80"/>
+        <w:ind w:left="283"/>
       </w:pPr>
       <w:r>
         <w:rPr>
           <w:i/>
-          <w:color w:val="5A5A5A"/>
+          <w:color w:val="595959"/>
           <w:sz w:val="20"/>
         </w:rPr>
-        <w:t>A pergunta sobre o clima da área é rotativa e eu não fiz nessa conversa.</w:t>
+        <w:t>Essa é rotativa e eu não fiz nessa conversa.</w:t>
       </w:r>
     </w:p>
     <w:p>
       <w:pPr>
-        <w:spacing w:before="300" w:after="60"/>
+        <w:spacing w:before="280" w:after="80"/>
       </w:pPr>
       <w:r>
         <w:rPr>
           <w:b/>
           <w:color w:val="C4122F"/>
-          <w:sz w:val="25"/>
+          <w:sz w:val="22"/>
         </w:rPr>
-        <w:t>Entrega, cases e projetos</w:t>
-      </w:r>
-    </w:p>
-    <w:p>
-      <w:r>
-        <w:rPr>
-          <w:color w:val="1A1A1A"/>
-        </w:rPr>
-        <w:t>Sobre os projetos rodando hoje e o que ela faria diferente, ela está contente com o caminhar do CWC. Como não estava na frente da organização, se sentia um pouco perdida por não receber a informação por mensagem. O que mudaria é incluir as meninas responsáveis desde o começo.</w:t>
-      </w:r>
-    </w:p>
-    <w:p>
-      <w:r>
-        <w:rPr>
-          <w:color w:val="1A1A1A"/>
-        </w:rPr>
-        <w:t>Perguntei se tem algum projeto que ela gostaria de assumir. Ela está contente onde está, no CWC, e gostou de terem abordado temas além da consultoria, porque agregam conhecimento.</w:t>
+        <w:t>2. ENTREGA, CASES E PROJETOS</w:t>
       </w:r>
     </w:p>
     <w:p>
       <w:pPr>
-        <w:spacing w:after="160"/>
+        <w:spacing w:before="160" w:after="40"/>
+      </w:pPr>
+      <w:r>
+        <w:rPr>
+          <w:b/>
+          <w:color w:val="8E0C22"/>
+          <w:sz w:val="20"/>
+        </w:rPr>
+        <w:t xml:space="preserve">Q5  </w:t>
+      </w:r>
+      <w:r>
+        <w:rPr>
+          <w:b/>
+          <w:color w:val="1A1A1A"/>
+          <w:sz w:val="20"/>
+        </w:rPr>
+        <w:t>Pensando nos projetos internos e externos rodando hoje, qual deles te deixa com a sensação de “eu faria isso diferente”? O que você mudaria?</w:t>
+      </w:r>
+    </w:p>
+    <w:p>
+      <w:pPr>
+        <w:spacing w:after="80"/>
+        <w:ind w:left="283"/>
+      </w:pPr>
+      <w:r>
+        <w:rPr>
+          <w:color w:val="1A1A1A"/>
+          <w:sz w:val="21"/>
+        </w:rPr>
+        <w:t>Está contente com o caminhar do CWC. Como não estava na frente da organização, se sentia um pouco perdida por não receber a informação por mensagem. O que mudaria é incluir as meninas responsáveis desde o começo.</w:t>
+      </w:r>
+    </w:p>
+    <w:p>
+      <w:pPr>
+        <w:spacing w:before="160" w:after="40"/>
+      </w:pPr>
+      <w:r>
+        <w:rPr>
+          <w:b/>
+          <w:color w:val="8E0C22"/>
+          <w:sz w:val="20"/>
+        </w:rPr>
+        <w:t xml:space="preserve">Q6  </w:t>
+      </w:r>
+      <w:r>
+        <w:rPr>
+          <w:b/>
+          <w:color w:val="1A1A1A"/>
+          <w:sz w:val="20"/>
+        </w:rPr>
+        <w:t>Tem algum projeto, ou tipo de projeto, que você gostaria de assumir? O que te atrai nele e o que hoje te segura de topar?</w:t>
+      </w:r>
+    </w:p>
+    <w:p>
+      <w:pPr>
+        <w:spacing w:after="80"/>
+        <w:ind w:left="283"/>
+      </w:pPr>
+      <w:r>
+        <w:rPr>
+          <w:color w:val="1A1A1A"/>
+          <w:sz w:val="21"/>
+        </w:rPr>
+        <w:t>Está contente onde está, no CWC, e gostou de terem abordado temas além da consultoria, porque agregam conhecimento.</w:t>
+      </w:r>
+    </w:p>
+    <w:p>
+      <w:pPr>
+        <w:spacing w:before="160" w:after="40"/>
+      </w:pPr>
+      <w:r>
+        <w:rPr>
+          <w:b/>
+          <w:color w:val="8E0C22"/>
+          <w:sz w:val="20"/>
+        </w:rPr>
+        <w:t xml:space="preserve">Q7  </w:t>
+      </w:r>
+      <w:r>
+        <w:rPr>
+          <w:b/>
+          <w:color w:val="1A1A1A"/>
+          <w:sz w:val="20"/>
+        </w:rPr>
+        <w:t>Qual foi a última entrega que te deu orgulho, e qual te mostrou um buraco que você ainda precisa fechar?</w:t>
+      </w:r>
+    </w:p>
+    <w:p>
+      <w:pPr>
+        <w:spacing w:after="80"/>
+        <w:ind w:left="283"/>
       </w:pPr>
       <w:r>
         <w:rPr>
           <w:i/>
-          <w:color w:val="5A5A5A"/>
+          <w:color w:val="595959"/>
           <w:sz w:val="20"/>
         </w:rPr>
-        <w:t>As perguntas sobre a última entrega e sobre criar um projeto do zero são rotativas e não entraram nessa conversa.</w:t>
+        <w:t>Essa é rotativa e eu não fiz nessa conversa.</w:t>
       </w:r>
     </w:p>
     <w:p>
       <w:pPr>
-        <w:spacing w:before="300" w:after="60"/>
+        <w:spacing w:before="160" w:after="40"/>
+      </w:pPr>
+      <w:r>
+        <w:rPr>
+          <w:b/>
+          <w:color w:val="8E0C22"/>
+          <w:sz w:val="20"/>
+        </w:rPr>
+        <w:t xml:space="preserve">Q8  </w:t>
+      </w:r>
+      <w:r>
+        <w:rPr>
+          <w:b/>
+          <w:color w:val="1A1A1A"/>
+          <w:sz w:val="20"/>
+        </w:rPr>
+        <w:t>Se você pudesse ser dono de um projeto do zero no clube, que problema real você gostaria de resolver e por quê?</w:t>
+      </w:r>
+    </w:p>
+    <w:p>
+      <w:pPr>
+        <w:spacing w:after="80"/>
+        <w:ind w:left="283"/>
+      </w:pPr>
+      <w:r>
+        <w:rPr>
+          <w:i/>
+          <w:color w:val="595959"/>
+          <w:sz w:val="20"/>
+        </w:rPr>
+        <w:t>Essa é rotativa e eu não fiz nessa conversa.</w:t>
+      </w:r>
+    </w:p>
+    <w:p>
+      <w:pPr>
+        <w:spacing w:before="280" w:after="80"/>
       </w:pPr>
       <w:r>
         <w:rPr>
           <w:b/>
           <w:color w:val="C4122F"/>
-          <w:sz w:val="25"/>
+          <w:sz w:val="22"/>
         </w:rPr>
-        <w:t>Preparação para o mercado</w:t>
+        <w:t>3. PREPARAÇÃO PARA O MERCADO</w:t>
       </w:r>
     </w:p>
     <w:p>
+      <w:pPr>
+        <w:spacing w:before="80" w:after="200"/>
+        <w:ind w:left="170"/>
+      </w:pPr>
       <w:r>
         <w:rPr>
-          <w:color w:val="1A1A1A"/>
+          <w:i/>
+          <w:color w:val="8E0C22"/>
+          <w:sz w:val="19"/>
         </w:rPr>
         <w:t>Esse bloco eu pulei de propósito. Como ela não vai prestar PS de consultoria, nota de prontidão para MBB, GMAT, estruturação de case e fit não medem nada no caso dela.</w:t>
       </w:r>
     </w:p>
     <w:p>
+      <w:pPr>
+        <w:spacing w:before="160" w:after="40"/>
+      </w:pPr>
       <w:r>
         <w:rPr>
+          <w:b/>
+          <w:color w:val="8E0C22"/>
+          <w:sz w:val="20"/>
+        </w:rPr>
+        <w:t xml:space="preserve">Q9  </w:t>
+      </w:r>
+      <w:r>
+        <w:rPr>
+          <w:b/>
           <w:color w:val="1A1A1A"/>
+          <w:sz w:val="20"/>
         </w:rPr>
-        <w:t>A única dessas que eu ainda quero fazer é a de o que ela aprendeu a fazer desde que entrou, porque essa não depende de consultoria e mede o desenvolvimento dela pelos objetivos que ela mesma colocou.</w:t>
+        <w:t>Numa escala de 0 a 10, quão pronto você se sente hoje para um PS de MBB?</w:t>
       </w:r>
     </w:p>
     <w:p>
       <w:pPr>
-        <w:spacing w:before="300" w:after="60"/>
+        <w:spacing w:after="80"/>
+        <w:ind w:left="283"/>
+      </w:pPr>
+      <w:r>
+        <w:rPr>
+          <w:i/>
+          <w:color w:val="595959"/>
+          <w:sz w:val="20"/>
+        </w:rPr>
+        <w:t>Não se aplica, ela não pretende prestar PS de consultoria.</w:t>
+      </w:r>
+    </w:p>
+    <w:p>
+      <w:pPr>
+        <w:spacing w:before="160" w:after="40"/>
+      </w:pPr>
+      <w:r>
+        <w:rPr>
+          <w:b/>
+          <w:color w:val="8E0C22"/>
+          <w:sz w:val="20"/>
+        </w:rPr>
+        <w:t xml:space="preserve">Q10  </w:t>
+      </w:r>
+      <w:r>
+        <w:rPr>
+          <w:b/>
+          <w:color w:val="1A1A1A"/>
+          <w:sz w:val="20"/>
+        </w:rPr>
+        <w:t>O que você sabe fazer hoje que não sabia quando entrou? Me dá um exemplo concreto.</w:t>
+      </w:r>
+    </w:p>
+    <w:p>
+      <w:pPr>
+        <w:spacing w:after="80"/>
+        <w:ind w:left="283"/>
+      </w:pPr>
+      <w:r>
+        <w:rPr>
+          <w:i/>
+          <w:color w:val="595959"/>
+          <w:sz w:val="20"/>
+        </w:rPr>
+        <w:t>Não perguntei. Essa vale recuperar na próxima conversa, porque não depende de consultoria e mede o desenvolvimento dela pelos objetivos que ela mesma colocou.</w:t>
+      </w:r>
+    </w:p>
+    <w:p>
+      <w:pPr>
+        <w:spacing w:before="160" w:after="40"/>
+      </w:pPr>
+      <w:r>
+        <w:rPr>
+          <w:b/>
+          <w:color w:val="8E0C22"/>
+          <w:sz w:val="20"/>
+        </w:rPr>
+        <w:t xml:space="preserve">Q11  </w:t>
+      </w:r>
+      <w:r>
+        <w:rPr>
+          <w:b/>
+          <w:color w:val="1A1A1A"/>
+          <w:sz w:val="20"/>
+        </w:rPr>
+        <w:t>Onde você está no GMAT / estruturação de case / fit hoje, e qual dessas frentes está mais atrasada para o seu alvo?</w:t>
+      </w:r>
+    </w:p>
+    <w:p>
+      <w:pPr>
+        <w:spacing w:after="80"/>
+        <w:ind w:left="283"/>
+      </w:pPr>
+      <w:r>
+        <w:rPr>
+          <w:i/>
+          <w:color w:val="595959"/>
+          <w:sz w:val="20"/>
+        </w:rPr>
+        <w:t>Não se aplica, não existe alvo de PS de consultoria no caso dela.</w:t>
+      </w:r>
+    </w:p>
+    <w:p>
+      <w:pPr>
+        <w:spacing w:before="280" w:after="80"/>
       </w:pPr>
       <w:r>
         <w:rPr>
           <w:b/>
           <w:color w:val="C4122F"/>
-          <w:sz w:val="25"/>
+          <w:sz w:val="22"/>
         </w:rPr>
-        <w:t>Futuro no clube</w:t>
-      </w:r>
-    </w:p>
-    <w:p>
-      <w:r>
-        <w:rPr>
-          <w:color w:val="1A1A1A"/>
-        </w:rPr>
-        <w:t>Perguntei o que precisaria ter acontecido, olhando para o último semestre dela, para sentir que valeu. Ela respondeu que seria legal ter mais momentos de capacitação junto com as empresas, porque ajuda no business sense e na estratégia que permeiam a consultoria. Os pontos de contato com o pessoal do clube ajudariam muito.</w:t>
-      </w:r>
-    </w:p>
-    <w:p>
-      <w:r>
-        <w:rPr>
-          <w:color w:val="1A1A1A"/>
-        </w:rPr>
-        <w:t>Diretoria ela não quer, e o motivo é objetivo: é o último semestre dela em Campinas, depois vai para São Paulo.</w:t>
-      </w:r>
-    </w:p>
-    <w:p>
-      <w:r>
-        <w:rPr>
-          <w:color w:val="1A1A1A"/>
-        </w:rPr>
-        <w:t>Não coletei a nota de 0 a 10 de chance de continuar no clube. Faltou.</w:t>
+        <w:t>4. FUTURO NO CLUBE E RESPONSABILIDADE</w:t>
       </w:r>
     </w:p>
     <w:p>
       <w:pPr>
-        <w:spacing w:before="300" w:after="60"/>
+        <w:spacing w:before="160" w:after="40"/>
+      </w:pPr>
+      <w:r>
+        <w:rPr>
+          <w:b/>
+          <w:color w:val="8E0C22"/>
+          <w:sz w:val="20"/>
+        </w:rPr>
+        <w:t xml:space="preserve">Q12  </w:t>
+      </w:r>
+      <w:r>
+        <w:rPr>
+          <w:b/>
+          <w:color w:val="1A1A1A"/>
+          <w:sz w:val="20"/>
+        </w:rPr>
+        <w:t>Quando você imagina seu último semestre no clube, o que precisa ter acontecido para você olhar para trás e sentir que valeu? Que tipo de responsabilidade caberia nisso?</w:t>
+      </w:r>
+    </w:p>
+    <w:p>
+      <w:pPr>
+        <w:spacing w:after="80"/>
+        <w:ind w:left="283"/>
+      </w:pPr>
+      <w:r>
+        <w:rPr>
+          <w:color w:val="1A1A1A"/>
+          <w:sz w:val="21"/>
+        </w:rPr>
+        <w:t>Ela respondeu que seria legal ter mais momentos de capacitação junto com as empresas, porque ajuda no business sense e na estratégia que permeiam a consultoria. Os pontos de contato com o pessoal do clube ajudariam muito.</w:t>
+      </w:r>
+    </w:p>
+    <w:p>
+      <w:pPr>
+        <w:spacing w:before="160" w:after="40"/>
+      </w:pPr>
+      <w:r>
+        <w:rPr>
+          <w:b/>
+          <w:color w:val="8E0C22"/>
+          <w:sz w:val="20"/>
+        </w:rPr>
+        <w:t xml:space="preserve">Q13  </w:t>
+      </w:r>
+      <w:r>
+        <w:rPr>
+          <w:b/>
+          <w:color w:val="1A1A1A"/>
+          <w:sz w:val="20"/>
+        </w:rPr>
+        <w:t>Numa escala de 0 a 10, qual a chance de você continuar no clube no próximo semestre? O que subiria esse número em dois pontos?</w:t>
+      </w:r>
+    </w:p>
+    <w:p>
+      <w:pPr>
+        <w:spacing w:after="80"/>
+        <w:ind w:left="283"/>
+      </w:pPr>
+      <w:r>
+        <w:rPr>
+          <w:i/>
+          <w:color w:val="595959"/>
+          <w:sz w:val="20"/>
+        </w:rPr>
+        <w:t>Não coletei. Faltou, e é justamente a nota de retenção.</w:t>
+      </w:r>
+    </w:p>
+    <w:p>
+      <w:pPr>
+        <w:spacing w:before="160" w:after="40"/>
+      </w:pPr>
+      <w:r>
+        <w:rPr>
+          <w:b/>
+          <w:color w:val="8E0C22"/>
+          <w:sz w:val="20"/>
+        </w:rPr>
+        <w:t xml:space="preserve">Q14  </w:t>
+      </w:r>
+      <w:r>
+        <w:rPr>
+          <w:b/>
+          <w:color w:val="1A1A1A"/>
+          <w:sz w:val="20"/>
+        </w:rPr>
+        <w:t>Você pensa em assumir um cargo de diretoria? Qual, e o que hoje pesa a favor e contra?</w:t>
+      </w:r>
+    </w:p>
+    <w:p>
+      <w:pPr>
+        <w:spacing w:after="80"/>
+        <w:ind w:left="283"/>
+      </w:pPr>
+      <w:r>
+        <w:rPr>
+          <w:color w:val="1A1A1A"/>
+          <w:sz w:val="21"/>
+        </w:rPr>
+        <w:t>Não quer, e o motivo é objetivo: é o último semestre dela em Campinas, depois vai para São Paulo.</w:t>
+      </w:r>
+    </w:p>
+    <w:p>
+      <w:pPr>
+        <w:spacing w:before="280" w:after="80"/>
       </w:pPr>
       <w:r>
         <w:rPr>
           <w:b/>
           <w:color w:val="C4122F"/>
-          <w:sz w:val="25"/>
+          <w:sz w:val="22"/>
         </w:rPr>
-        <w:t>Feedback para a diretoria</w:t>
-      </w:r>
-    </w:p>
-    <w:p>
-      <w:r>
-        <w:rPr>
-          <w:color w:val="1A1A1A"/>
-        </w:rPr>
-        <w:t>Perguntei o que ela mudaria se fosse a diretora responsável por ela na semana seguinte. Ela disse que o Procópio já implementou tudo o que ela teria feito: criação de modelos e tudo organizado no Drive. Comentou que são momentos sazonais, e essa resposta ficou cortada na planilha.</w:t>
-      </w:r>
-    </w:p>
-    <w:p>
-      <w:r>
-        <w:rPr>
-          <w:color w:val="1A1A1A"/>
-        </w:rPr>
-        <w:t>Sobre o que a diretoria não está enxergando, ela pediu transparência do que acontece em cada área. Por conta do PS ela ficou um pouco perdida com os vídeos. Essa também ficou cortada.</w:t>
+        <w:t>5. FEEDBACK PARA A DIRETORIA</w:t>
       </w:r>
     </w:p>
     <w:p>
       <w:pPr>
-        <w:spacing w:before="300" w:after="60"/>
+        <w:spacing w:before="160" w:after="40"/>
+      </w:pPr>
+      <w:r>
+        <w:rPr>
+          <w:b/>
+          <w:color w:val="8E0C22"/>
+          <w:sz w:val="20"/>
+        </w:rPr>
+        <w:t xml:space="preserve">Q15  </w:t>
+      </w:r>
+      <w:r>
+        <w:rPr>
+          <w:b/>
+          <w:color w:val="1A1A1A"/>
+          <w:sz w:val="20"/>
+        </w:rPr>
+        <w:t>Se você fosse o diretor responsável por você na semana que vem, qual seria a primeira coisa que mudaria na forma como a sua área é conduzida?</w:t>
+      </w:r>
+    </w:p>
+    <w:p>
+      <w:pPr>
+        <w:spacing w:after="80"/>
+        <w:ind w:left="283"/>
+      </w:pPr>
+      <w:r>
+        <w:rPr>
+          <w:color w:val="1A1A1A"/>
+          <w:sz w:val="21"/>
+        </w:rPr>
+        <w:t>Ela disse que o Procópio já implementou tudo o que ela teria feito: criação de modelos e tudo organizado no Drive. Comentou que são momentos sazonais. A resposta ficou cortada na planilha.</w:t>
+      </w:r>
+    </w:p>
+    <w:p>
+      <w:pPr>
+        <w:spacing w:before="160" w:after="40"/>
+      </w:pPr>
+      <w:r>
+        <w:rPr>
+          <w:b/>
+          <w:color w:val="8E0C22"/>
+          <w:sz w:val="20"/>
+        </w:rPr>
+        <w:t xml:space="preserve">Q16  </w:t>
+      </w:r>
+      <w:r>
+        <w:rPr>
+          <w:b/>
+          <w:color w:val="1A1A1A"/>
+          <w:sz w:val="20"/>
+        </w:rPr>
+        <w:t>O que você sente que a diretoria não está enxergando hoje, sobre você, sobre sua área ou sobre o clube, que faria diferença se a gente soubesse?</w:t>
+      </w:r>
+    </w:p>
+    <w:p>
+      <w:pPr>
+        <w:spacing w:after="80"/>
+        <w:ind w:left="283"/>
+      </w:pPr>
+      <w:r>
+        <w:rPr>
+          <w:color w:val="1A1A1A"/>
+          <w:sz w:val="21"/>
+        </w:rPr>
+        <w:t>Pediu transparência do que acontece em cada área. Por conta do PS ela ficou um pouco perdida com os vídeos. Essa também ficou cortada na planilha.</w:t>
+      </w:r>
+    </w:p>
+    <w:p>
+      <w:pPr>
+        <w:spacing w:before="280" w:after="80"/>
       </w:pPr>
       <w:r>
         <w:rPr>
           <w:b/>
           <w:color w:val="C4122F"/>
-          <w:sz w:val="25"/>
+          <w:sz w:val="22"/>
         </w:rPr>
-        <w:t>O que eu tirei da conversa</w:t>
-      </w:r>
-    </w:p>
-    <w:p>
-      <w:r>
-        <w:rPr>
-          <w:color w:val="1A1A1A"/>
-        </w:rPr>
-        <w:t>Ela está satisfeita e sem atrito com a área. O feedback ao Procópio não é elogio genérico: é específico, e ela chega a dizer que ele implementou o que ela mesma faria.</w:t>
-      </w:r>
-    </w:p>
-    <w:p>
-      <w:r>
-        <w:rPr>
-          <w:color w:val="1A1A1A"/>
-        </w:rPr>
-        <w:t>O objetivo dela não é consultoria, e isso é legítimo. Só significa que o acompanhamento dela tem que medir outra coisa. Prontidão para PS não diz nada aqui.</w:t>
-      </w:r>
-    </w:p>
-    <w:p>
-      <w:r>
-        <w:rPr>
-          <w:color w:val="1A1A1A"/>
-        </w:rPr>
-        <w:t>Os dois pedidos que ela trouxe são acionáveis: mais capacitação junto com as empresas e transparência do que cada área está fazendo.</w:t>
-      </w:r>
-    </w:p>
-    <w:p>
-      <w:r>
-        <w:rPr>
-          <w:color w:val="1A1A1A"/>
-        </w:rPr>
-        <w:t>Uma coisa que eu preciso confirmar com ela: diz que este é o último semestre em Campinas e que vai para São Paulo, mas colocou o horizonte de saída no segundo semestre de 2027 e disse que a rotina do clube não atrapalha. Pode ser que pretenda continuar de longe, mas isso não ficou claro, e eu não peguei a nota de retenção.</w:t>
+        <w:t>LEITURA DA CONVERSA</w:t>
       </w:r>
     </w:p>
     <w:p>
       <w:pPr>
-        <w:spacing w:before="300" w:after="60"/>
+        <w:pStyle w:val="ListBullet"/>
+        <w:spacing w:after="60"/>
+      </w:pPr>
+      <w:r>
+        <w:rPr>
+          <w:sz w:val="21"/>
+        </w:rPr>
+        <w:t>Ela está satisfeita e sem atrito com a área. O feedback ao Procópio não é elogio genérico, é específico, e ela chega a dizer que ele implementou o que ela mesma faria.</w:t>
+      </w:r>
+    </w:p>
+    <w:p>
+      <w:pPr>
+        <w:pStyle w:val="ListBullet"/>
+        <w:spacing w:after="60"/>
+      </w:pPr>
+      <w:r>
+        <w:rPr>
+          <w:sz w:val="21"/>
+        </w:rPr>
+        <w:t>O objetivo dela não é consultoria, e isso é legítimo. Só quer dizer que o acompanhamento dela tem que medir outra coisa, porque prontidão para PS não diz nada aqui.</w:t>
+      </w:r>
+    </w:p>
+    <w:p>
+      <w:pPr>
+        <w:pStyle w:val="ListBullet"/>
+        <w:spacing w:after="60"/>
+      </w:pPr>
+      <w:r>
+        <w:rPr>
+          <w:sz w:val="21"/>
+        </w:rPr>
+        <w:t>Os dois pedidos que ela trouxe dão para agir: mais capacitação junto com as empresas e transparência do que cada área está fazendo, já que ela se perdeu durante o PS.</w:t>
+      </w:r>
+    </w:p>
+    <w:p>
+      <w:pPr>
+        <w:pStyle w:val="ListBullet"/>
+        <w:spacing w:after="60"/>
+      </w:pPr>
+      <w:r>
+        <w:rPr>
+          <w:sz w:val="21"/>
+        </w:rPr>
+        <w:t>As críticas dela são de processo, não de pessoa: reuniões curtas que caberiam numa mensagem, e incluir as responsáveis do CWC desde o início para não depender de informação repassada.</w:t>
+      </w:r>
+    </w:p>
+    <w:p>
+      <w:pPr>
+        <w:pStyle w:val="ListBullet"/>
+        <w:spacing w:after="60"/>
+      </w:pPr>
+      <w:r>
+        <w:rPr>
+          <w:sz w:val="21"/>
+        </w:rPr>
+        <w:t>Preciso confirmar uma coisa: ela diz que este é o último semestre em Campinas e que vai para São Paulo, mas colocou o horizonte de saída no segundo semestre de 2027 e disse que a rotina do clube não atrapalha. Pode ser que pretenda continuar de longe, mas não ficou claro.</w:t>
+      </w:r>
+    </w:p>
+    <w:p>
+      <w:pPr>
+        <w:spacing w:before="280" w:after="80"/>
       </w:pPr>
       <w:r>
         <w:rPr>
           <w:b/>
           <w:color w:val="C4122F"/>
-          <w:sz w:val="25"/>
+          <w:sz w:val="22"/>
         </w:rPr>
-        <w:t>Pendências</w:t>
+        <w:t>PENDÊNCIAS</w:t>
       </w:r>
     </w:p>
     <w:p>
       <w:pPr>
         <w:pStyle w:val="ListBullet"/>
-        <w:spacing w:after="80"/>
+        <w:spacing w:after="60"/>
       </w:pPr>
       <w:r>
-        <w:t>Pegar a nota de chance de continuar no clube.</w:t>
+        <w:rPr>
+          <w:sz w:val="21"/>
+        </w:rPr>
+        <w:t>Pegar a nota de chance de continuar no clube. É a que dispara conversa de retenção quando fica em 6 ou menos, e no caso dela a mudança para São Paulo é uma variável real.</w:t>
       </w:r>
     </w:p>
     <w:p>
       <w:pPr>
         <w:pStyle w:val="ListBullet"/>
-        <w:spacing w:after="80"/>
+        <w:spacing w:after="60"/>
       </w:pPr>
       <w:r>
-        <w:t>Fazer a pergunta do que ela aprendeu desde que entrou.</w:t>
+        <w:rPr>
+          <w:sz w:val="21"/>
+        </w:rPr>
+        <w:t>Fazer a pergunta do que ela aprendeu desde que entrou, que não depende de consultoria.</w:t>
       </w:r>
     </w:p>
     <w:p>
       <w:pPr>
         <w:pStyle w:val="ListBullet"/>
-        <w:spacing w:after="80"/>
+        <w:spacing w:after="60"/>
       </w:pPr>
       <w:r>
-        <w:t>Completar as três respostas que ficaram cortadas na planilha.</w:t>
+        <w:rPr>
+          <w:sz w:val="21"/>
+        </w:rPr>
+        <w:t>Completar as três respostas que ficaram cortadas na planilha, duas do bloco de feedback e a do horizonte de saída.</w:t>
       </w:r>
     </w:p>
     <w:p>
       <w:pPr>
         <w:pStyle w:val="ListBullet"/>
-        <w:spacing w:after="80"/>
+        <w:spacing w:after="60"/>
       </w:pPr>
       <w:r>
-        <w:t>Definir um combinado com ela, porque não ficou nada marcado.</w:t>
+        <w:rPr>
+          <w:sz w:val="21"/>
+        </w:rPr>
+        <w:t>Definir um combinado com ela, porque não ficou nada marcado e ela trouxe dois pedidos claros.</w:t>
       </w:r>
     </w:p>
     <w:sectPr>
       <w:headerReference w:type="default" r:id="rId9"/>
       <w:pgSz w:w="12240" w:h="15840"/>
-      <w:pgMar w:top="907" w:right="1361" w:bottom="1134" w:left="1361" w:header="720" w:footer="720" w:gutter="0"/>
+      <w:pgMar w:top="850" w:right="1247" w:bottom="1134" w:left="1247" w:header="720" w:footer="720" w:gutter="0"/>
       <w:cols w:space="720"/>
       <w:docGrid w:linePitch="360"/>
     </w:sectPr>
@@ -480,7 +1084,6 @@
   <w:p>
     <w:pPr>
       <w:pStyle w:val="Header"/>
-      <w:spacing w:after="40"/>
       <w:jc w:val="left"/>
     </w:pPr>
     <w:r>
@@ -495,7 +1098,7 @@
             <a:graphicData uri="http://schemas.openxmlformats.org/drawingml/2006/picture">
               <pic:pic>
                 <pic:nvPicPr>
-                  <pic:cNvPr id="0" name="logo_icon.png"/>
+                  <pic:cNvPr id="0" name="logo-ccu.png"/>
                   <pic:cNvPicPr/>
                 </pic:nvPicPr>
                 <pic:blipFill>
@@ -885,11 +1488,11 @@
     <w:qFormat/>
     <w:rsid w:val="00FC693F"/>
     <w:pPr>
-      <w:spacing w:after="160" w:line="276" w:lineRule="auto"/>
+      <w:spacing w:after="120"/>
     </w:pPr>
     <w:rPr>
       <w:rFonts w:ascii="Calibri" w:hAnsi="Calibri"/>
-      <w:sz w:val="22"/>
+      <w:sz w:val="21"/>
     </w:rPr>
   </w:style>
   <w:style w:type="paragraph" w:styleId="Header">

</xml_diff>